<commit_message>
Make manuscript self-contained without supplement
</commit_message>
<xml_diff>
--- a/paper/SimPT60_submission_en.docx
+++ b/paper/SimPT60_submission_en.docx
@@ -1003,7 +1003,7 @@
                 <w:b w:val="0"/>
                 <w:sz w:val="16"/>
               </w:rPr>
-              <w:t xml:space="preserve">Validation and application</w:t>
+              <w:t xml:space="preserve">Validation and scenario records</w:t>
             </w:r>
           </w:p>
         </w:tc>
@@ -1030,7 +1030,7 @@
                 <w:b w:val="0"/>
                 <w:sz w:val="16"/>
               </w:rPr>
-              <w:t xml:space="preserve">External temporal/spatial comparisons, perturbation tests, stress scenarios, and N−1</w:t>
+              <w:t xml:space="preserve">External temporal/spatial comparisons, perturbation tests, and sampled N−1 screening</w:t>
             </w:r>
           </w:p>
         </w:tc>
@@ -2657,7 +2657,7 @@
           <w:rFonts w:ascii="Times New Roman" w:hAnsi="Times New Roman" w:eastAsia="Times New Roman" w:cs="Times New Roman"/>
           <w:sz w:val="21"/>
         </w:rPr>
-        <w:t xml:space="preserve">Both Europe/Lisbon local time and UTC are retained. Stable identifiers are derived from source equipment codes, and every derived object retains source keys and processing status. Supplementary Table S1 maps raw source fields to standardized semantics.</w:t>
+        <w:t xml:space="preserve">Both Europe/Lisbon local time and UTC are retained. Stable identifiers are derived from source equipment codes, and every derived object retains source keys and processing status. Table 5 summarizes the principal transformations; the released data dictionary maps each source field to its standardized meaning, transformation, join key, and missing-data rule.</w:t>
       </w:r>
     </w:p>
     <w:bookmarkEnd w:id="24"/>
@@ -4385,7 +4385,7 @@
           <w:rFonts w:ascii="Times New Roman" w:hAnsi="Times New Roman" w:eastAsia="Times New Roman" w:cs="Times New Roman"/>
           <w:sz w:val="21"/>
         </w:rPr>
-        <w:t xml:space="preserve">Rules are defined in the Static network reconstruction subsection and</w:t>
+        <w:t xml:space="preserve">Rules are defined in the Static network reconstruction subsection and the frozen</w:t>
       </w:r>
       <w:r>
         <w:rPr>
@@ -4407,7 +4407,7 @@
           <w:rFonts w:ascii="Times New Roman" w:hAnsi="Times New Roman" w:eastAsia="Times New Roman" w:cs="Times New Roman"/>
           <w:sz w:val="21"/>
         </w:rPr>
-        <w:t xml:space="preserve">. All distances are projected planar distances. They are reconstruction rules, not operator accuracy guarantees. Default electrical parameters and coverage rules are reported in Supplementary Table S2.</w:t>
+        <w:t xml:space="preserve">. All distances are projected planar distances. They are reconstruction rules, not operator accuracy guarantees. The configuration file records voltage-class defaults, cable factors, transformer proxies, and seasonal rating factors; equipment tables retain the field-level evidence status and any source-backed override.</w:t>
       </w:r>
     </w:p>
     <w:bookmarkEnd w:id="30"/>
@@ -6172,7 +6172,7 @@
           <w:rFonts w:ascii="Times New Roman" w:hAnsi="Times New Roman" w:eastAsia="Times New Roman" w:cs="Times New Roman"/>
           <w:sz w:val="21"/>
         </w:rPr>
-        <w:t xml:space="preserve">REN imports and exports are aligned to the common calendar but withheld from boundary-power enforcement. Before solution, the pipeline checks timestamps, required series, mapping completeness, load and generation conservation, and capacity limits. Table 5 summarizes the executable mapping and conservation rules; Supplementary Table S3 lists the associated audit fields.</w:t>
+        <w:t xml:space="preserve">REN imports and exports are aligned to the common calendar but withheld from boundary-power enforcement. Before solution, the pipeline checks timestamps, required series, mapping completeness, load and generation conservation, and capacity limits. Table 5 summarizes the executable mapping and conservation rules. The associated source, bus-assignment, availability, observed-load, residual-load, reactive-power, boundary, and conservation fields are retained in the equipment tables and each case-level audit bundle.</w:t>
       </w:r>
     </w:p>
     <w:p>
@@ -6517,7 +6517,112 @@
                 <w:b w:val="0"/>
                 <w:sz w:val="16"/>
               </w:rPr>
-              <w:t xml:space="preserve">Capacity ≥100 MW searches ≥150 kV; otherwise ≥60 kV</w:t>
+              <w:t xml:space="preserve">Capacity</w:t>
+            </w:r>
+            <w:r>
+              <w:rPr>
+                <w:rFonts w:ascii="Times New Roman" w:hAnsi="Times New Roman" w:eastAsia="Times New Roman" w:cs="Times New Roman"/>
+                <w:b w:val="0"/>
+                <w:sz w:val="16"/>
+              </w:rPr>
+              <w:t xml:space="preserve"> </w:t>
+            </w:r>
+            <m:oMath>
+              <m:r>
+                <m:rPr>
+                  <m:sty m:val="p"/>
+                </m:rPr>
+                <m:t>≥</m:t>
+              </m:r>
+              <m:r>
+                <m:t>100</m:t>
+              </m:r>
+            </m:oMath>
+            <w:r>
+              <w:rPr>
+                <w:rFonts w:ascii="Times New Roman" w:hAnsi="Times New Roman" w:eastAsia="Times New Roman" w:cs="Times New Roman"/>
+                <w:b w:val="0"/>
+                <w:sz w:val="16"/>
+              </w:rPr>
+              <w:t xml:space="preserve"> </w:t>
+            </w:r>
+            <w:r>
+              <w:rPr>
+                <w:rFonts w:ascii="Times New Roman" w:hAnsi="Times New Roman" w:eastAsia="Times New Roman" w:cs="Times New Roman"/>
+                <w:b w:val="0"/>
+                <w:sz w:val="16"/>
+              </w:rPr>
+              <w:t xml:space="preserve">MW searches</w:t>
+            </w:r>
+            <w:r>
+              <w:rPr>
+                <w:rFonts w:ascii="Times New Roman" w:hAnsi="Times New Roman" w:eastAsia="Times New Roman" w:cs="Times New Roman"/>
+                <w:b w:val="0"/>
+                <w:sz w:val="16"/>
+              </w:rPr>
+              <w:t xml:space="preserve"> </w:t>
+            </w:r>
+            <m:oMath>
+              <m:r>
+                <m:rPr>
+                  <m:sty m:val="p"/>
+                </m:rPr>
+                <m:t>≥</m:t>
+              </m:r>
+              <m:r>
+                <m:t>150</m:t>
+              </m:r>
+            </m:oMath>
+            <w:r>
+              <w:rPr>
+                <w:rFonts w:ascii="Times New Roman" w:hAnsi="Times New Roman" w:eastAsia="Times New Roman" w:cs="Times New Roman"/>
+                <w:b w:val="0"/>
+                <w:sz w:val="16"/>
+              </w:rPr>
+              <w:t xml:space="preserve"> </w:t>
+            </w:r>
+            <w:r>
+              <w:rPr>
+                <w:rFonts w:ascii="Times New Roman" w:hAnsi="Times New Roman" w:eastAsia="Times New Roman" w:cs="Times New Roman"/>
+                <w:b w:val="0"/>
+                <w:sz w:val="16"/>
+              </w:rPr>
+              <w:t xml:space="preserve">kV; otherwise</w:t>
+            </w:r>
+            <w:r>
+              <w:rPr>
+                <w:rFonts w:ascii="Times New Roman" w:hAnsi="Times New Roman" w:eastAsia="Times New Roman" w:cs="Times New Roman"/>
+                <w:b w:val="0"/>
+                <w:sz w:val="16"/>
+              </w:rPr>
+              <w:t xml:space="preserve"> </w:t>
+            </w:r>
+            <m:oMath>
+              <m:r>
+                <m:rPr>
+                  <m:sty m:val="p"/>
+                </m:rPr>
+                <m:t>≥</m:t>
+              </m:r>
+              <m:r>
+                <m:t>60</m:t>
+              </m:r>
+            </m:oMath>
+            <w:r>
+              <w:rPr>
+                <w:rFonts w:ascii="Times New Roman" w:hAnsi="Times New Roman" w:eastAsia="Times New Roman" w:cs="Times New Roman"/>
+                <w:b w:val="0"/>
+                <w:sz w:val="16"/>
+              </w:rPr>
+              <w:t xml:space="preserve"> </w:t>
+            </w:r>
+            <w:r>
+              <w:rPr>
+                <w:rFonts w:ascii="Times New Roman" w:hAnsi="Times New Roman" w:eastAsia="Times New Roman" w:cs="Times New Roman"/>
+                <w:b w:val="0"/>
+                <w:sz w:val="16"/>
+              </w:rPr>
+              <w:t xml:space="preserve">kV</w:t>
             </w:r>
           </w:p>
         </w:tc>
@@ -7832,7 +7937,7 @@
           <w:rFonts w:ascii="Times New Roman" w:hAnsi="Times New Roman" w:eastAsia="Times New Roman" w:cs="Times New Roman"/>
           <w:sz w:val="21"/>
         </w:rPr>
-        <w:t xml:space="preserve">vary with time. The principal dataset contains one case per interval; sensitivity experiments use separately selected representative times; worked applications are documented in Supplementary Note S5.</w:t>
+        <w:t xml:space="preserve">vary with time. The principal dataset contains one case per interval, while sensitivity and contingency records use separately selected representative times and are stored in distinct scenario tables.</w:t>
       </w:r>
     </w:p>
     <w:bookmarkStart w:id="36" w:name="case-assembly-and-solution"/>
@@ -8178,7 +8283,77 @@
                 <w:b w:val="0"/>
                 <w:sz w:val="16"/>
               </w:rPr>
-              <w:t xml:space="preserve">Non-battery; installed capacity ≥20 MW and voltage ≥60 kV</w:t>
+              <w:t xml:space="preserve">Non-battery; installed capacity</w:t>
+            </w:r>
+            <w:r>
+              <w:rPr>
+                <w:rFonts w:ascii="Times New Roman" w:hAnsi="Times New Roman" w:eastAsia="Times New Roman" w:cs="Times New Roman"/>
+                <w:b w:val="0"/>
+                <w:sz w:val="16"/>
+              </w:rPr>
+              <w:t xml:space="preserve"> </w:t>
+            </w:r>
+            <m:oMath>
+              <m:r>
+                <m:rPr>
+                  <m:sty m:val="p"/>
+                </m:rPr>
+                <m:t>≥</m:t>
+              </m:r>
+              <m:r>
+                <m:t>20</m:t>
+              </m:r>
+            </m:oMath>
+            <w:r>
+              <w:rPr>
+                <w:rFonts w:ascii="Times New Roman" w:hAnsi="Times New Roman" w:eastAsia="Times New Roman" w:cs="Times New Roman"/>
+                <w:b w:val="0"/>
+                <w:sz w:val="16"/>
+              </w:rPr>
+              <w:t xml:space="preserve"> </w:t>
+            </w:r>
+            <w:r>
+              <w:rPr>
+                <w:rFonts w:ascii="Times New Roman" w:hAnsi="Times New Roman" w:eastAsia="Times New Roman" w:cs="Times New Roman"/>
+                <w:b w:val="0"/>
+                <w:sz w:val="16"/>
+              </w:rPr>
+              <w:t xml:space="preserve">MW and voltage</w:t>
+            </w:r>
+            <w:r>
+              <w:rPr>
+                <w:rFonts w:ascii="Times New Roman" w:hAnsi="Times New Roman" w:eastAsia="Times New Roman" w:cs="Times New Roman"/>
+                <w:b w:val="0"/>
+                <w:sz w:val="16"/>
+              </w:rPr>
+              <w:t xml:space="preserve"> </w:t>
+            </w:r>
+            <m:oMath>
+              <m:r>
+                <m:rPr>
+                  <m:sty m:val="p"/>
+                </m:rPr>
+                <m:t>≥</m:t>
+              </m:r>
+              <m:r>
+                <m:t>60</m:t>
+              </m:r>
+            </m:oMath>
+            <w:r>
+              <w:rPr>
+                <w:rFonts w:ascii="Times New Roman" w:hAnsi="Times New Roman" w:eastAsia="Times New Roman" w:cs="Times New Roman"/>
+                <w:b w:val="0"/>
+                <w:sz w:val="16"/>
+              </w:rPr>
+              <w:t xml:space="preserve"> </w:t>
+            </w:r>
+            <w:r>
+              <w:rPr>
+                <w:rFonts w:ascii="Times New Roman" w:hAnsi="Times New Roman" w:eastAsia="Times New Roman" w:cs="Times New Roman"/>
+                <w:b w:val="0"/>
+                <w:sz w:val="16"/>
+              </w:rPr>
+              <w:t xml:space="preserve">kV</w:t>
             </w:r>
           </w:p>
         </w:tc>
@@ -9499,7 +9674,7 @@
           <w:rFonts w:ascii="Times New Roman" w:hAnsi="Times New Roman" w:eastAsia="Times New Roman" w:cs="Times New Roman"/>
           <w:sz w:val="21"/>
         </w:rPr>
-        <w:t xml:space="preserve">records input fingerprints and case counts. Supplementary Table S5 provides the complete data-layer, grain, and join-key inventory.</w:t>
+        <w:t xml:space="preserve">records input fingerprints and case counts. The released data dictionary provides the complete data-layer, grain, field-type, constraint, and join-key inventory.</w:t>
       </w:r>
     </w:p>
     <w:bookmarkEnd w:id="39"/>
@@ -9798,7 +9973,7 @@
           <w:rFonts w:ascii="Times New Roman" w:hAnsi="Times New Roman" w:eastAsia="Times New Roman" w:cs="Times New Roman"/>
           <w:sz w:val="21"/>
         </w:rPr>
-        <w:t xml:space="preserve">A case summary, state arrays, and audit bundle are committed in one transaction. Any failure rolls back the full case and retains an error record. Before formal monthly release, source and copy counts for completed cases, arrays, and audit bundles must match. Supplementary Table S4 lists thresholds, failure behavior, and record locations.</w:t>
+        <w:t xml:space="preserve">A case summary, state arrays, and audit bundle are committed in one transaction. Any failure rolls back the full case and retains an error record. Before formal monthly release, expected intervals, completed cases, state arrays, and audit bundles must have matching counts; a failed check prevents the month from being marked complete. Thresholds, failure states, and record locations are preserved in the released configuration, case tables, audit bundles, and run manifests.</w:t>
       </w:r>
     </w:p>
     <w:bookmarkEnd w:id="40"/>
@@ -10531,7 +10706,7 @@
           <w:rFonts w:ascii="Times New Roman" w:hAnsi="Times New Roman" w:eastAsia="Times New Roman" w:cs="Times New Roman"/>
           <w:sz w:val="21"/>
         </w:rPr>
-        <w:t xml:space="preserve">tables expand state arrays to equipment-long form; the static device order is stored once per month. Supplementary Table S5 lists fields and joins.</w:t>
+        <w:t xml:space="preserve">tables expand state arrays to equipment-long form; the static device order is stored once per month. The released data dictionary lists all fields and joins.</w:t>
       </w:r>
     </w:p>
     <w:p>
@@ -10544,7 +10719,7 @@
           <w:rFonts w:ascii="Times New Roman" w:hAnsi="Times New Roman" w:eastAsia="Times New Roman" w:cs="Times New Roman"/>
           <w:sz w:val="21"/>
         </w:rPr>
-        <w:t xml:space="preserve">The main database also contains the N−1 application results described in Supplementary Note S5. Dedicated scenario tables record six representative times, 9,894 contingency-level results, post-contingency overloads, control-search bounds, and run provenance. These tables remain separate from the continuous 15-minute cases so that sampled security screening is not mistaken for continuous operating observation.</w:t>
+        <w:t xml:space="preserve">The main database also contains a sampled N−1 screening panel at six preselected operating times: maximum and minimum load, maximum wind, maximum photovoltaic generation, maximum net import, and maximum net export. The same 1,649 outage groups are used at every time, comprising 1,421 line-circuit groups and 228 transformer groups, for 9,894 contingency-level records. Line eligibility excludes 156 out-of-service rows, two station busbars, and 14 rows without a finite base-case result; the latter category is distinct from zero current and from out-of-service status. Dedicated scenario tables store membership, post-contingency overloads, islands, solution status, control-search bounds, and run provenance. These sampled records remain separate from the continuous 15-minute cases.</w:t>
       </w:r>
     </w:p>
     <w:bookmarkEnd w:id="48"/>
@@ -10574,7 +10749,7 @@
           <w:rFonts w:ascii="Times New Roman" w:hAnsi="Times New Roman" w:eastAsia="Times New Roman" w:cs="Times New Roman"/>
           <w:sz w:val="21"/>
         </w:rPr>
-        <w:t xml:space="preserve">The frozen release comprises the analysis-ready main database, 11 monthly result databases, source and provenance records, and validation and application results. Stable model identifiers join the static network to the common calendar in the main database. Case identifiers and fixed equipment order join summaries, state arrays, and audit bundles in the monthly databases. Raw files are distributed when licensing permits; otherwise, the release provides source metadata and download scripts.</w:t>
+        <w:t xml:space="preserve">The frozen release comprises the analysis-ready main database, 11 monthly result databases, source and provenance records, validation products, and scenario records. Stable model identifiers join the static network to the common calendar in the main database. Case identifiers and fixed equipment order join summaries, state arrays, and audit bundles in the monthly databases. Raw files are distributed when licensing permits; otherwise, the release provides source metadata and download scripts.</w:t>
       </w:r>
       <w:r>
         <w:rPr>
@@ -10642,6 +10817,7 @@
       <w:pPr>
         <w:pStyle w:val="FirstParagraph"/>
         <w:widowControl/>
+        <w:jc w:val="left"/>
       </w:pPr>
       <w:r>
         <w:rPr>
@@ -10671,7 +10847,36 @@
           <w:rFonts w:ascii="Times New Roman" w:hAnsi="Times New Roman" w:eastAsia="Times New Roman" w:cs="Times New Roman"/>
           <w:sz w:val="21"/>
         </w:rPr>
-        <w:t xml:space="preserve">. The 31,492 historical cases and the main technical validation use CORE-3783: 3,783 buses, 4,943 lines, and 228 transformer rows. The contingency examples in Supplementary Note S5 use N1-3787. That variant adds four colocated connection nodes to correct the Lanheses–Feitosa topology while retaining 4,943 line rows and 228 transformer rows. The single Estoi transformer row represents three parallel 126 MVA units rather than one equivalent unit; consequently, N1-3787 contains 230 equivalent transformer units but still 228 transformer rows and 228 transformer outage groups. An Estoi unit outage is represented by decreasing the row’s parallel count from three to two. Results from the two variants cannot be interchanged and attributed to one model. Supplementary Note S2 lists the required differences; the release manifest records field-level differences and hashes.</w:t>
+        <w:t xml:space="preserve">. The 31,492 historical cases and the main technical validation use CORE-3783: 3,783 buses, 4,943 lines, and 228 transformer rows. The sampled contingency panel uses N1-3787. That variant adds four colocated connection nodes to correct the Lanheses–Feitosa topology while retaining 4,943 line rows and 228 transformer rows. The single Estoi transformer row represents three parallel 126 MVA units rather than one equivalent unit; consequently, N1-3787 contains 230 equivalent transformer units but still 228 transformer rows and 228 transformer outage groups. An Estoi unit outage is represented by decreasing the row’s parallel count from three to two. Results from the two variants cannot be interchanged and attributed to one model. The release manifest and</w:t>
+      </w:r>
+      <w:r>
+        <w:rPr>
+          <w:rFonts w:ascii="Times New Roman" w:hAnsi="Times New Roman" w:eastAsia="Times New Roman" w:cs="Times New Roman"/>
+          <w:sz w:val="21"/>
+        </w:rPr>
+        <w:t xml:space="preserve"> </w:t>
+      </w:r>
+      <w:r>
+        <w:rPr>
+          <w:rStyle w:val="VerbatimChar"/>
+          <w:rFonts w:ascii="Times New Roman" w:hAnsi="Times New Roman" w:eastAsia="Times New Roman" w:cs="Times New Roman"/>
+          <w:sz w:val="21"/>
+        </w:rPr>
+        <w:t xml:space="preserve">model_field_diff.csv</w:t>
+      </w:r>
+      <w:r>
+        <w:rPr>
+          <w:rFonts w:ascii="Times New Roman" w:hAnsi="Times New Roman" w:eastAsia="Times New Roman" w:cs="Times New Roman"/>
+          <w:sz w:val="21"/>
+        </w:rPr>
+        <w:t xml:space="preserve"> </w:t>
+      </w:r>
+      <w:r>
+        <w:rPr>
+          <w:rFonts w:ascii="Times New Roman" w:hAnsi="Times New Roman" w:eastAsia="Times New Roman" w:cs="Times New Roman"/>
+          <w:sz w:val="21"/>
+        </w:rPr>
+        <w:t xml:space="preserve">record the field-level differences, hashes, environment, and replay commands.</w:t>
       </w:r>
     </w:p>
     <w:bookmarkEnd w:id="50"/>
@@ -12666,7 +12871,7 @@
                 <w:b w:val="0"/>
                 <w:sz w:val="16"/>
               </w:rPr>
-              <w:t xml:space="preserve">Application</w:t>
+              <w:t xml:space="preserve">Scenario records</w:t>
             </w:r>
           </w:p>
         </w:tc>
@@ -12693,7 +12898,7 @@
                 <w:b w:val="0"/>
                 <w:sz w:val="16"/>
               </w:rPr>
-              <w:t xml:space="preserve">Full-element N−1</w:t>
+              <w:t xml:space="preserve">Sampled full-element N−1</w:t>
             </w:r>
           </w:p>
         </w:tc>
@@ -12747,7 +12952,7 @@
                 <w:b w:val="0"/>
                 <w:sz w:val="16"/>
               </w:rPr>
-              <w:t xml:space="preserve">1,649 elements per time</w:t>
+              <w:t xml:space="preserve">1,649 outage groups per time</w:t>
             </w:r>
           </w:p>
         </w:tc>
@@ -12779,7 +12984,7 @@
           <w:rFonts w:ascii="Times New Roman" w:hAnsi="Times New Roman" w:eastAsia="Times New Roman" w:cs="Times New Roman"/>
           <w:sz w:val="21"/>
         </w:rPr>
-        <w:t xml:space="preserve">Counts describe the released CORE-3783 variant. N−1 uses N1-3787. The Frozen release and model-version reconciliation subsection and Supplementary Note S2 define their object-level differences, section applicability, and fixed hashes.</w:t>
+        <w:t xml:space="preserve">Counts describe the released CORE-3783 variant. N−1 uses N1-3787. The Frozen release and model-version reconciliation subsection defines their object-level differences, section applicability, and fixed hashes.</w:t>
       </w:r>
     </w:p>
     <w:bookmarkEnd w:id="55"/>
@@ -14463,7 +14668,7 @@
           <w:rFonts w:ascii="Times New Roman" w:hAnsi="Times New Roman" w:eastAsia="Times New Roman" w:cs="Times New Roman"/>
           <w:sz w:val="21"/>
         </w:rPr>
-        <w:t xml:space="preserve">Figure 5 summarizes ranking, hotspot-set, and maximum-loading responses. Supplementary Table S6 contains all paired results. Hotspot persistence shows that no line remains in the Top 20 across every annual time and configuration (Supplementary Figure S1). Supplementary Table S7 reports ablations of reactive-power limits, PV targets, compensation, reactors, and tap control.</w:t>
+        <w:t xml:space="preserve">Figure 5 summarizes ranking, hotspot-set, and maximum-loading responses. Across the 12 configurations evaluated at each time, 74 of 4,943 lines enter the Top 20 at least once, 56 reach an inclusion frequency of at least 0.8 at one or more times, and the largest frequency across all 264 experiments is 207/264 (78.4%); no line remains in the Top 20 at every time and configuration. A separate 242-case operating-proxy ablation changes reactive-power limits, PV targets, load compensation, shunt reactors, and tap control at the same 22 times. All cases converge. Halving reactive-power limits produces the largest minimum-voltage change (0.02845 p.u.) and a 1.419-percentage-point maximum-line-loading change; active ratio-tap voltage control produces the largest maximum-transformer-loading change (4.305 percentage points). The complete paired results and configuration identifiers are released as machine-readable CSV.</w:t>
       </w:r>
     </w:p>
     <w:p>
@@ -15921,7 +16126,7 @@
           <w:rFonts w:ascii="Times New Roman" w:hAnsi="Times New Roman" w:eastAsia="Times New Roman" w:cs="Times New Roman"/>
           <w:sz w:val="21"/>
         </w:rPr>
-        <w:t xml:space="preserve">A station-held-out experiment divides 394 matched stations into five deterministic folds. At 22 times, it compares global capacity share, five geographically nearest stations, and five nearest stations along the reconstructed network, yielding 8,541 observation pairs. Table 10 shows that network-neighbor MAE is approximately 9.9% below global capacity share, but is not lower than geographic-neighbor MAE and has an overlapping confidence interval. Reconstructed connectivity therefore contains useful proximity information but does not independently recover precise nodal demand. Supplementary Note S3 specifies folds, distance weights, and bootstrap procedures.</w:t>
+        <w:t xml:space="preserve">A station-held-out experiment divides 394 matched stations into five deterministic folds. At 22 times, it compares global capacity share, five geographically nearest stations, and five nearest stations along the reconstructed network, yielding 8,541 observation pairs. Neighbor predictions use inverse-distance weights; network distance uses in-service line length and a small positive transformer-edge length. Confidence intervals are obtained by a 1,000-replicate station-cluster bootstrap using fixed fold assignments. Table 10 shows that network-neighbor MAE is approximately 9.9% below global capacity share, but is not lower than geographic-neighbor MAE and has an overlapping confidence interval. Reconstructed connectivity therefore contains useful proximity information but does not independently recover precise nodal demand. Fold assignments, pair-level predictions, and recomputation code are included in the released validation package.</w:t>
       </w:r>
     </w:p>
     <w:p>
@@ -16695,13 +16900,212 @@
       <w:pPr>
         <w:pStyle w:val="FirstParagraph"/>
         <w:widowControl/>
+        <w:jc w:val="left"/>
       </w:pPr>
       <w:r>
         <w:rPr>
           <w:rFonts w:ascii="Times New Roman" w:hAnsi="Times New Roman" w:eastAsia="Times New Roman" w:cs="Times New Roman"/>
           <w:sz w:val="21"/>
         </w:rPr>
-        <w:t xml:space="preserve">The release is designed for reproducible time-series power-flow studies, relative scenario comparison, and method testing. Users should select the model variant explicitly: CORE-3783 is the static network used by the 31,492 archived operating cases and their validation products, whereas N1-3787 is restricted to the corrected contingency examples. The main and monthly DuckDB files can be joined through stable model, equipment, case, and UTC timestamp identifiers; Supplementary Tables S3 and S5 list the principal evidence and join fields.</w:t>
+        <w:t xml:space="preserve">The release is designed for reproducible time-series power-flow studies, relative scenario comparison, and method testing. Users should select the model variant explicitly: CORE-3783 is the static network used by the 31,492 archived operating cases and their validation products, whereas N1-3787 is restricted to the sampled contingency panel. The main and monthly DuckDB files join through stable model, equipment, case, and UTC timestamp identifiers. Principal evidence and mapping fields include</w:t>
+      </w:r>
+      <w:r>
+        <w:rPr>
+          <w:rFonts w:ascii="Times New Roman" w:hAnsi="Times New Roman" w:eastAsia="Times New Roman" w:cs="Times New Roman"/>
+          <w:sz w:val="21"/>
+        </w:rPr>
+        <w:t xml:space="preserve"> </w:t>
+      </w:r>
+      <w:r>
+        <w:rPr>
+          <w:rStyle w:val="VerbatimChar"/>
+          <w:rFonts w:ascii="Times New Roman" w:hAnsi="Times New Roman" w:eastAsia="Times New Roman" w:cs="Times New Roman"/>
+          <w:sz w:val="21"/>
+        </w:rPr>
+        <w:t xml:space="preserve">source_id</w:t>
+      </w:r>
+      <w:r>
+        <w:rPr>
+          <w:rFonts w:ascii="Times New Roman" w:hAnsi="Times New Roman" w:eastAsia="Times New Roman" w:cs="Times New Roman"/>
+          <w:sz w:val="21"/>
+        </w:rPr>
+        <w:t xml:space="preserve">,</w:t>
+      </w:r>
+      <w:r>
+        <w:rPr>
+          <w:rFonts w:ascii="Times New Roman" w:hAnsi="Times New Roman" w:eastAsia="Times New Roman" w:cs="Times New Roman"/>
+          <w:sz w:val="21"/>
+        </w:rPr>
+        <w:t xml:space="preserve"> </w:t>
+      </w:r>
+      <w:r>
+        <w:rPr>
+          <w:rStyle w:val="VerbatimChar"/>
+          <w:rFonts w:ascii="Times New Roman" w:hAnsi="Times New Roman" w:eastAsia="Times New Roman" w:cs="Times New Roman"/>
+          <w:sz w:val="21"/>
+        </w:rPr>
+        <w:t xml:space="preserve">bus_id</w:t>
+      </w:r>
+      <w:r>
+        <w:rPr>
+          <w:rFonts w:ascii="Times New Roman" w:hAnsi="Times New Roman" w:eastAsia="Times New Roman" w:cs="Times New Roman"/>
+          <w:sz w:val="21"/>
+        </w:rPr>
+        <w:t xml:space="preserve">,</w:t>
+      </w:r>
+      <w:r>
+        <w:rPr>
+          <w:rFonts w:ascii="Times New Roman" w:hAnsi="Times New Roman" w:eastAsia="Times New Roman" w:cs="Times New Roman"/>
+          <w:sz w:val="21"/>
+        </w:rPr>
+        <w:t xml:space="preserve"> </w:t>
+      </w:r>
+      <w:r>
+        <w:rPr>
+          <w:rStyle w:val="VerbatimChar"/>
+          <w:rFonts w:ascii="Times New Roman" w:hAnsi="Times New Roman" w:eastAsia="Times New Roman" w:cs="Times New Roman"/>
+          <w:sz w:val="21"/>
+        </w:rPr>
+        <w:t xml:space="preserve">bus_assignment_rule</w:t>
+      </w:r>
+      <w:r>
+        <w:rPr>
+          <w:rFonts w:ascii="Times New Roman" w:hAnsi="Times New Roman" w:eastAsia="Times New Roman" w:cs="Times New Roman"/>
+          <w:sz w:val="21"/>
+        </w:rPr>
+        <w:t xml:space="preserve">,</w:t>
+      </w:r>
+      <w:r>
+        <w:rPr>
+          <w:rFonts w:ascii="Times New Roman" w:hAnsi="Times New Roman" w:eastAsia="Times New Roman" w:cs="Times New Roman"/>
+          <w:sz w:val="21"/>
+        </w:rPr>
+        <w:t xml:space="preserve"> </w:t>
+      </w:r>
+      <w:r>
+        <w:rPr>
+          <w:rStyle w:val="VerbatimChar"/>
+          <w:rFonts w:ascii="Times New Roman" w:hAnsi="Times New Roman" w:eastAsia="Times New Roman" w:cs="Times New Roman"/>
+          <w:sz w:val="21"/>
+        </w:rPr>
+        <w:t xml:space="preserve">available_from_utc</w:t>
+      </w:r>
+      <w:r>
+        <w:rPr>
+          <w:rFonts w:ascii="Times New Roman" w:hAnsi="Times New Roman" w:eastAsia="Times New Roman" w:cs="Times New Roman"/>
+          <w:sz w:val="21"/>
+        </w:rPr>
+        <w:t xml:space="preserve">,</w:t>
+      </w:r>
+      <w:r>
+        <w:rPr>
+          <w:rFonts w:ascii="Times New Roman" w:hAnsi="Times New Roman" w:eastAsia="Times New Roman" w:cs="Times New Roman"/>
+          <w:sz w:val="21"/>
+        </w:rPr>
+        <w:t xml:space="preserve"> </w:t>
+      </w:r>
+      <w:r>
+        <w:rPr>
+          <w:rStyle w:val="VerbatimChar"/>
+          <w:rFonts w:ascii="Times New Roman" w:hAnsi="Times New Roman" w:eastAsia="Times New Roman" w:cs="Times New Roman"/>
+          <w:sz w:val="21"/>
+        </w:rPr>
+        <w:t xml:space="preserve">source_status</w:t>
+      </w:r>
+      <w:r>
+        <w:rPr>
+          <w:rFonts w:ascii="Times New Roman" w:hAnsi="Times New Roman" w:eastAsia="Times New Roman" w:cs="Times New Roman"/>
+          <w:sz w:val="21"/>
+        </w:rPr>
+        <w:t xml:space="preserve">, and field-level parameter status; case-level inputs and results join through</w:t>
+      </w:r>
+      <w:r>
+        <w:rPr>
+          <w:rFonts w:ascii="Times New Roman" w:hAnsi="Times New Roman" w:eastAsia="Times New Roman" w:cs="Times New Roman"/>
+          <w:sz w:val="21"/>
+        </w:rPr>
+        <w:t xml:space="preserve"> </w:t>
+      </w:r>
+      <w:r>
+        <w:rPr>
+          <w:rStyle w:val="VerbatimChar"/>
+          <w:rFonts w:ascii="Times New Roman" w:hAnsi="Times New Roman" w:eastAsia="Times New Roman" w:cs="Times New Roman"/>
+          <w:sz w:val="21"/>
+        </w:rPr>
+        <w:t xml:space="preserve">case_id</w:t>
+      </w:r>
+      <w:r>
+        <w:rPr>
+          <w:rFonts w:ascii="Times New Roman" w:hAnsi="Times New Roman" w:eastAsia="Times New Roman" w:cs="Times New Roman"/>
+          <w:sz w:val="21"/>
+        </w:rPr>
+        <w:t xml:space="preserve">,</w:t>
+      </w:r>
+      <w:r>
+        <w:rPr>
+          <w:rFonts w:ascii="Times New Roman" w:hAnsi="Times New Roman" w:eastAsia="Times New Roman" w:cs="Times New Roman"/>
+          <w:sz w:val="21"/>
+        </w:rPr>
+        <w:t xml:space="preserve"> </w:t>
+      </w:r>
+      <w:r>
+        <w:rPr>
+          <w:rStyle w:val="VerbatimChar"/>
+          <w:rFonts w:ascii="Times New Roman" w:hAnsi="Times New Roman" w:eastAsia="Times New Roman" w:cs="Times New Roman"/>
+          <w:sz w:val="21"/>
+        </w:rPr>
+        <w:t xml:space="preserve">timestamp_utc</w:t>
+      </w:r>
+      <w:r>
+        <w:rPr>
+          <w:rFonts w:ascii="Times New Roman" w:hAnsi="Times New Roman" w:eastAsia="Times New Roman" w:cs="Times New Roman"/>
+          <w:sz w:val="21"/>
+        </w:rPr>
+        <w:t xml:space="preserve">,</w:t>
+      </w:r>
+      <w:r>
+        <w:rPr>
+          <w:rFonts w:ascii="Times New Roman" w:hAnsi="Times New Roman" w:eastAsia="Times New Roman" w:cs="Times New Roman"/>
+          <w:sz w:val="21"/>
+        </w:rPr>
+        <w:t xml:space="preserve"> </w:t>
+      </w:r>
+      <w:r>
+        <w:rPr>
+          <w:rStyle w:val="VerbatimChar"/>
+          <w:rFonts w:ascii="Times New Roman" w:hAnsi="Times New Roman" w:eastAsia="Times New Roman" w:cs="Times New Roman"/>
+          <w:sz w:val="21"/>
+        </w:rPr>
+        <w:t xml:space="preserve">bus_order</w:t>
+      </w:r>
+      <w:r>
+        <w:rPr>
+          <w:rFonts w:ascii="Times New Roman" w:hAnsi="Times New Roman" w:eastAsia="Times New Roman" w:cs="Times New Roman"/>
+          <w:sz w:val="21"/>
+        </w:rPr>
+        <w:t xml:space="preserve">, and</w:t>
+      </w:r>
+      <w:r>
+        <w:rPr>
+          <w:rFonts w:ascii="Times New Roman" w:hAnsi="Times New Roman" w:eastAsia="Times New Roman" w:cs="Times New Roman"/>
+          <w:sz w:val="21"/>
+        </w:rPr>
+        <w:t xml:space="preserve"> </w:t>
+      </w:r>
+      <w:r>
+        <w:rPr>
+          <w:rStyle w:val="VerbatimChar"/>
+          <w:rFonts w:ascii="Times New Roman" w:hAnsi="Times New Roman" w:eastAsia="Times New Roman" w:cs="Times New Roman"/>
+          <w:sz w:val="21"/>
+        </w:rPr>
+        <w:t xml:space="preserve">line_order</w:t>
+      </w:r>
+      <w:r>
+        <w:rPr>
+          <w:rFonts w:ascii="Times New Roman" w:hAnsi="Times New Roman" w:eastAsia="Times New Roman" w:cs="Times New Roman"/>
+          <w:sz w:val="21"/>
+        </w:rPr>
+        <w:t xml:space="preserve">.</w:t>
       </w:r>
     </w:p>
     <w:p>
@@ -16759,7 +17163,7 @@
           <w:rFonts w:ascii="Times New Roman" w:hAnsi="Times New Roman" w:eastAsia="Times New Roman" w:cs="Times New Roman"/>
           <w:sz w:val="21"/>
         </w:rPr>
-        <w:t xml:space="preserve">, allocation-audit fields, and the stated screening thresholds. Supplementary Notes S4–S5 provide the contingency definitions, detailed diagnostics, and worked stress-scenario and N−1 examples.</w:t>
+        <w:t xml:space="preserve">, allocation-audit fields, and the stated screening thresholds. In the contingency panel, the incremental flag requires principal-solution convergence, no material island, and no new voltage or thermal violation relative to the corresponding N−0 state. It does not identify every worsening of a pre-existing violation, so absolute post-contingency voltage and loading values must remain the primary screening outputs.</w:t>
       </w:r>
     </w:p>
     <w:bookmarkEnd w:id="80"/>

</xml_diff>

<commit_message>
Correct table lead-ins and source citations
</commit_message>
<xml_diff>
--- a/paper/SimPT60_submission_en.docx
+++ b/paper/SimPT60_submission_en.docx
@@ -332,7 +332,49 @@
           <w:rFonts w:ascii="Times New Roman" w:hAnsi="Times New Roman" w:eastAsia="Times New Roman" w:cs="Times New Roman"/>
           <w:sz w:val="21"/>
         </w:rPr>
-        <w:t xml:space="preserve">equipment attributes, and operating conditions</w:t>
+        <w:t xml:space="preserve">equipment attributes, and operating conditions. As research moves from</w:t>
+      </w:r>
+      <w:r>
+        <w:rPr>
+          <w:rFonts w:ascii="Times New Roman" w:hAnsi="Times New Roman" w:eastAsia="Times New Roman" w:cs="Times New Roman"/>
+          <w:sz w:val="21"/>
+        </w:rPr>
+        <w:t xml:space="preserve"> </w:t>
+      </w:r>
+      <w:r>
+        <w:rPr>
+          <w:rFonts w:ascii="Times New Roman" w:hAnsi="Times New Roman" w:eastAsia="Times New Roman" w:cs="Times New Roman"/>
+          <w:sz w:val="21"/>
+        </w:rPr>
+        <w:t xml:space="preserve">individual snapshots to time-series analysis, a static network must also</w:t>
+      </w:r>
+      <w:r>
+        <w:rPr>
+          <w:rFonts w:ascii="Times New Roman" w:hAnsi="Times New Roman" w:eastAsia="Times New Roman" w:cs="Times New Roman"/>
+          <w:sz w:val="21"/>
+        </w:rPr>
+        <w:t xml:space="preserve"> </w:t>
+      </w:r>
+      <w:r>
+        <w:rPr>
+          <w:rFonts w:ascii="Times New Roman" w:hAnsi="Times New Roman" w:eastAsia="Times New Roman" w:cs="Times New Roman"/>
+          <w:sz w:val="21"/>
+        </w:rPr>
+        <w:t xml:space="preserve">be linked to continuous load, generation, and other operating</w:t>
+      </w:r>
+      <w:r>
+        <w:rPr>
+          <w:rFonts w:ascii="Times New Roman" w:hAnsi="Times New Roman" w:eastAsia="Times New Roman" w:cs="Times New Roman"/>
+          <w:sz w:val="21"/>
+        </w:rPr>
+        <w:t xml:space="preserve"> </w:t>
+      </w:r>
+      <w:r>
+        <w:rPr>
+          <w:rFonts w:ascii="Times New Roman" w:hAnsi="Times New Roman" w:eastAsia="Times New Roman" w:cs="Times New Roman"/>
+          <w:sz w:val="21"/>
+        </w:rPr>
+        <w:t xml:space="preserve">records</w:t>
       </w:r>
       <w:r>
         <w:rPr>
@@ -340,64 +382,7 @@
           <w:sz w:val="21"/>
           <w:vertAlign w:val="superscript"/>
         </w:rPr>
-        <w:t xml:space="preserve">1</w:t>
-      </w:r>
-      <w:r>
-        <w:rPr>
-          <w:rFonts w:ascii="Times New Roman" w:hAnsi="Times New Roman" w:eastAsia="Times New Roman" w:cs="Times New Roman"/>
-          <w:sz w:val="21"/>
-        </w:rPr>
-        <w:t xml:space="preserve">. As</w:t>
-      </w:r>
-      <w:r>
-        <w:rPr>
-          <w:rFonts w:ascii="Times New Roman" w:hAnsi="Times New Roman" w:eastAsia="Times New Roman" w:cs="Times New Roman"/>
-          <w:sz w:val="21"/>
-        </w:rPr>
-        <w:t xml:space="preserve"> </w:t>
-      </w:r>
-      <w:r>
-        <w:rPr>
-          <w:rFonts w:ascii="Times New Roman" w:hAnsi="Times New Roman" w:eastAsia="Times New Roman" w:cs="Times New Roman"/>
-          <w:sz w:val="21"/>
-        </w:rPr>
-        <w:t xml:space="preserve">research moves from individual snapshots to time-series analysis, a</w:t>
-      </w:r>
-      <w:r>
-        <w:rPr>
-          <w:rFonts w:ascii="Times New Roman" w:hAnsi="Times New Roman" w:eastAsia="Times New Roman" w:cs="Times New Roman"/>
-          <w:sz w:val="21"/>
-        </w:rPr>
-        <w:t xml:space="preserve"> </w:t>
-      </w:r>
-      <w:r>
-        <w:rPr>
-          <w:rFonts w:ascii="Times New Roman" w:hAnsi="Times New Roman" w:eastAsia="Times New Roman" w:cs="Times New Roman"/>
-          <w:sz w:val="21"/>
-        </w:rPr>
-        <w:t xml:space="preserve">static network must also be linked to continuous load, generation, and</w:t>
-      </w:r>
-      <w:r>
-        <w:rPr>
-          <w:rFonts w:ascii="Times New Roman" w:hAnsi="Times New Roman" w:eastAsia="Times New Roman" w:cs="Times New Roman"/>
-          <w:sz w:val="21"/>
-        </w:rPr>
-        <w:t xml:space="preserve"> </w:t>
-      </w:r>
-      <w:r>
-        <w:rPr>
-          <w:rFonts w:ascii="Times New Roman" w:hAnsi="Times New Roman" w:eastAsia="Times New Roman" w:cs="Times New Roman"/>
-          <w:sz w:val="21"/>
-        </w:rPr>
-        <w:t xml:space="preserve">other operating records</w:t>
-      </w:r>
-      <w:r>
-        <w:rPr>
-          <w:rFonts w:ascii="Times New Roman" w:hAnsi="Times New Roman" w:eastAsia="Times New Roman" w:cs="Times New Roman"/>
-          <w:sz w:val="21"/>
-          <w:vertAlign w:val="superscript"/>
-        </w:rPr>
-        <w:t xml:space="preserve">2,3</w:t>
+        <w:t xml:space="preserve">1,2</w:t>
       </w:r>
       <w:r>
         <w:rPr>
@@ -467,93 +452,93 @@
           <w:sz w:val="21"/>
           <w:vertAlign w:val="superscript"/>
         </w:rPr>
+        <w:t xml:space="preserve">1</w:t>
+      </w:r>
+      <w:r>
+        <w:rPr>
+          <w:rFonts w:ascii="Times New Roman" w:hAnsi="Times New Roman" w:eastAsia="Times New Roman" w:cs="Times New Roman"/>
+          <w:sz w:val="21"/>
+        </w:rPr>
+        <w:t xml:space="preserve">. Recent open-data reconstruction work has</w:t>
+      </w:r>
+      <w:r>
+        <w:rPr>
+          <w:rFonts w:ascii="Times New Roman" w:hAnsi="Times New Roman" w:eastAsia="Times New Roman" w:cs="Times New Roman"/>
+          <w:sz w:val="21"/>
+        </w:rPr>
+        <w:t xml:space="preserve"> </w:t>
+      </w:r>
+      <w:r>
+        <w:rPr>
+          <w:rFonts w:ascii="Times New Roman" w:hAnsi="Times New Roman" w:eastAsia="Times New Roman" w:cs="Times New Roman"/>
+          <w:sz w:val="21"/>
+        </w:rPr>
+        <w:t xml:space="preserve">expanded the geographic representation of the European high-voltage</w:t>
+      </w:r>
+      <w:r>
+        <w:rPr>
+          <w:rFonts w:ascii="Times New Roman" w:hAnsi="Times New Roman" w:eastAsia="Times New Roman" w:cs="Times New Roman"/>
+          <w:sz w:val="21"/>
+        </w:rPr>
+        <w:t xml:space="preserve"> </w:t>
+      </w:r>
+      <w:r>
+        <w:rPr>
+          <w:rFonts w:ascii="Times New Roman" w:hAnsi="Times New Roman" w:eastAsia="Times New Roman" w:cs="Times New Roman"/>
+          <w:sz w:val="21"/>
+        </w:rPr>
+        <w:t xml:space="preserve">grid</w:t>
+      </w:r>
+      <w:r>
+        <w:rPr>
+          <w:rFonts w:ascii="Times New Roman" w:hAnsi="Times New Roman" w:eastAsia="Times New Roman" w:cs="Times New Roman"/>
+          <w:sz w:val="21"/>
+          <w:vertAlign w:val="superscript"/>
+        </w:rPr>
+        <w:t xml:space="preserve">3</w:t>
+      </w:r>
+      <w:r>
+        <w:rPr>
+          <w:rFonts w:ascii="Times New Roman" w:hAnsi="Times New Roman" w:eastAsia="Times New Roman" w:cs="Times New Roman"/>
+          <w:sz w:val="21"/>
+        </w:rPr>
+        <w:t xml:space="preserve">. SimBench provides representative networks</w:t>
+      </w:r>
+      <w:r>
+        <w:rPr>
+          <w:rFonts w:ascii="Times New Roman" w:hAnsi="Times New Roman" w:eastAsia="Times New Roman" w:cs="Times New Roman"/>
+          <w:sz w:val="21"/>
+        </w:rPr>
+        <w:t xml:space="preserve"> </w:t>
+      </w:r>
+      <w:r>
+        <w:rPr>
+          <w:rFonts w:ascii="Times New Roman" w:hAnsi="Times New Roman" w:eastAsia="Times New Roman" w:cs="Times New Roman"/>
+          <w:sz w:val="21"/>
+        </w:rPr>
+        <w:t xml:space="preserve">across several voltage levels together with annual load and generation</w:t>
+      </w:r>
+      <w:r>
+        <w:rPr>
+          <w:rFonts w:ascii="Times New Roman" w:hAnsi="Times New Roman" w:eastAsia="Times New Roman" w:cs="Times New Roman"/>
+          <w:sz w:val="21"/>
+        </w:rPr>
+        <w:t xml:space="preserve"> </w:t>
+      </w:r>
+      <w:r>
+        <w:rPr>
+          <w:rFonts w:ascii="Times New Roman" w:hAnsi="Times New Roman" w:eastAsia="Times New Roman" w:cs="Times New Roman"/>
+          <w:sz w:val="21"/>
+        </w:rPr>
+        <w:t xml:space="preserve">profiles</w:t>
+      </w:r>
+      <w:r>
+        <w:rPr>
+          <w:rFonts w:ascii="Times New Roman" w:hAnsi="Times New Roman" w:eastAsia="Times New Roman" w:cs="Times New Roman"/>
+          <w:sz w:val="21"/>
+          <w:vertAlign w:val="superscript"/>
+        </w:rPr>
         <w:t xml:space="preserve">2</w:t>
-      </w:r>
-      <w:r>
-        <w:rPr>
-          <w:rFonts w:ascii="Times New Roman" w:hAnsi="Times New Roman" w:eastAsia="Times New Roman" w:cs="Times New Roman"/>
-          <w:sz w:val="21"/>
-        </w:rPr>
-        <w:t xml:space="preserve">. Recent open-data reconstruction work has</w:t>
-      </w:r>
-      <w:r>
-        <w:rPr>
-          <w:rFonts w:ascii="Times New Roman" w:hAnsi="Times New Roman" w:eastAsia="Times New Roman" w:cs="Times New Roman"/>
-          <w:sz w:val="21"/>
-        </w:rPr>
-        <w:t xml:space="preserve"> </w:t>
-      </w:r>
-      <w:r>
-        <w:rPr>
-          <w:rFonts w:ascii="Times New Roman" w:hAnsi="Times New Roman" w:eastAsia="Times New Roman" w:cs="Times New Roman"/>
-          <w:sz w:val="21"/>
-        </w:rPr>
-        <w:t xml:space="preserve">expanded the geographic representation of the European high-voltage</w:t>
-      </w:r>
-      <w:r>
-        <w:rPr>
-          <w:rFonts w:ascii="Times New Roman" w:hAnsi="Times New Roman" w:eastAsia="Times New Roman" w:cs="Times New Roman"/>
-          <w:sz w:val="21"/>
-        </w:rPr>
-        <w:t xml:space="preserve"> </w:t>
-      </w:r>
-      <w:r>
-        <w:rPr>
-          <w:rFonts w:ascii="Times New Roman" w:hAnsi="Times New Roman" w:eastAsia="Times New Roman" w:cs="Times New Roman"/>
-          <w:sz w:val="21"/>
-        </w:rPr>
-        <w:t xml:space="preserve">grid</w:t>
-      </w:r>
-      <w:r>
-        <w:rPr>
-          <w:rFonts w:ascii="Times New Roman" w:hAnsi="Times New Roman" w:eastAsia="Times New Roman" w:cs="Times New Roman"/>
-          <w:sz w:val="21"/>
-          <w:vertAlign w:val="superscript"/>
-        </w:rPr>
-        <w:t xml:space="preserve">4</w:t>
-      </w:r>
-      <w:r>
-        <w:rPr>
-          <w:rFonts w:ascii="Times New Roman" w:hAnsi="Times New Roman" w:eastAsia="Times New Roman" w:cs="Times New Roman"/>
-          <w:sz w:val="21"/>
-        </w:rPr>
-        <w:t xml:space="preserve">. SimBench provides representative networks</w:t>
-      </w:r>
-      <w:r>
-        <w:rPr>
-          <w:rFonts w:ascii="Times New Roman" w:hAnsi="Times New Roman" w:eastAsia="Times New Roman" w:cs="Times New Roman"/>
-          <w:sz w:val="21"/>
-        </w:rPr>
-        <w:t xml:space="preserve"> </w:t>
-      </w:r>
-      <w:r>
-        <w:rPr>
-          <w:rFonts w:ascii="Times New Roman" w:hAnsi="Times New Roman" w:eastAsia="Times New Roman" w:cs="Times New Roman"/>
-          <w:sz w:val="21"/>
-        </w:rPr>
-        <w:t xml:space="preserve">across several voltage levels together with annual load and generation</w:t>
-      </w:r>
-      <w:r>
-        <w:rPr>
-          <w:rFonts w:ascii="Times New Roman" w:hAnsi="Times New Roman" w:eastAsia="Times New Roman" w:cs="Times New Roman"/>
-          <w:sz w:val="21"/>
-        </w:rPr>
-        <w:t xml:space="preserve"> </w:t>
-      </w:r>
-      <w:r>
-        <w:rPr>
-          <w:rFonts w:ascii="Times New Roman" w:hAnsi="Times New Roman" w:eastAsia="Times New Roman" w:cs="Times New Roman"/>
-          <w:sz w:val="21"/>
-        </w:rPr>
-        <w:t xml:space="preserve">profiles</w:t>
-      </w:r>
-      <w:r>
-        <w:rPr>
-          <w:rFonts w:ascii="Times New Roman" w:hAnsi="Times New Roman" w:eastAsia="Times New Roman" w:cs="Times New Roman"/>
-          <w:sz w:val="21"/>
-          <w:vertAlign w:val="superscript"/>
-        </w:rPr>
-        <w:t xml:space="preserve">3</w:t>
       </w:r>
       <w:r>
         <w:rPr>
@@ -667,7 +652,7 @@
           <w:sz w:val="21"/>
           <w:vertAlign w:val="superscript"/>
         </w:rPr>
-        <w:t xml:space="preserve">5</w:t>
+        <w:t xml:space="preserve">4</w:t>
       </w:r>
       <w:r>
         <w:rPr>
@@ -807,70 +792,70 @@
           <w:sz w:val="21"/>
           <w:vertAlign w:val="superscript"/>
         </w:rPr>
-        <w:t xml:space="preserve">6–10</w:t>
-      </w:r>
-      <w:r>
-        <w:rPr>
-          <w:rFonts w:ascii="Times New Roman" w:hAnsi="Times New Roman" w:eastAsia="Times New Roman" w:cs="Times New Roman"/>
-          <w:sz w:val="21"/>
-        </w:rPr>
-        <w:t xml:space="preserve">. Their spatial</w:t>
-      </w:r>
-      <w:r>
-        <w:rPr>
-          <w:rFonts w:ascii="Times New Roman" w:hAnsi="Times New Roman" w:eastAsia="Times New Roman" w:cs="Times New Roman"/>
-          <w:sz w:val="21"/>
-        </w:rPr>
-        <w:t xml:space="preserve"> </w:t>
-      </w:r>
-      <w:r>
-        <w:rPr>
-          <w:rFonts w:ascii="Times New Roman" w:hAnsi="Times New Roman" w:eastAsia="Times New Roman" w:cs="Times New Roman"/>
-          <w:sz w:val="21"/>
-        </w:rPr>
-        <w:t xml:space="preserve">coverage, temporal resolution, identifiers, and field definitions</w:t>
-      </w:r>
-      <w:r>
-        <w:rPr>
-          <w:rFonts w:ascii="Times New Roman" w:hAnsi="Times New Roman" w:eastAsia="Times New Roman" w:cs="Times New Roman"/>
-          <w:sz w:val="21"/>
-        </w:rPr>
-        <w:t xml:space="preserve"> </w:t>
-      </w:r>
-      <w:r>
-        <w:rPr>
-          <w:rFonts w:ascii="Times New Roman" w:hAnsi="Times New Roman" w:eastAsia="Times New Roman" w:cs="Times New Roman"/>
-          <w:sz w:val="21"/>
-        </w:rPr>
-        <w:t xml:space="preserve">differ. Using them in a common power-flow model requires topology</w:t>
-      </w:r>
-      <w:r>
-        <w:rPr>
-          <w:rFonts w:ascii="Times New Roman" w:hAnsi="Times New Roman" w:eastAsia="Times New Roman" w:cs="Times New Roman"/>
-          <w:sz w:val="21"/>
-        </w:rPr>
-        <w:t xml:space="preserve"> </w:t>
-      </w:r>
-      <w:r>
-        <w:rPr>
-          <w:rFonts w:ascii="Times New Roman" w:hAnsi="Times New Roman" w:eastAsia="Times New Roman" w:cs="Times New Roman"/>
-          <w:sz w:val="21"/>
-        </w:rPr>
-        <w:t xml:space="preserve">reconstruction, completion of electrical parameters, asset-to-bus</w:t>
-      </w:r>
-      <w:r>
-        <w:rPr>
-          <w:rFonts w:ascii="Times New Roman" w:hAnsi="Times New Roman" w:eastAsia="Times New Roman" w:cs="Times New Roman"/>
-          <w:sz w:val="21"/>
-        </w:rPr>
-        <w:t xml:space="preserve"> </w:t>
-      </w:r>
-      <w:r>
-        <w:rPr>
-          <w:rFonts w:ascii="Times New Roman" w:hAnsi="Times New Roman" w:eastAsia="Times New Roman" w:cs="Times New Roman"/>
-          <w:sz w:val="21"/>
-        </w:rPr>
-        <w:t xml:space="preserve">mapping, temporal alignment, and allocation of aggregate power to nodes.</w:t>
+        <w:t xml:space="preserve">5–9</w:t>
+      </w:r>
+      <w:r>
+        <w:rPr>
+          <w:rFonts w:ascii="Times New Roman" w:hAnsi="Times New Roman" w:eastAsia="Times New Roman" w:cs="Times New Roman"/>
+          <w:sz w:val="21"/>
+        </w:rPr>
+        <w:t xml:space="preserve">. Their spatial coverage,</w:t>
+      </w:r>
+      <w:r>
+        <w:rPr>
+          <w:rFonts w:ascii="Times New Roman" w:hAnsi="Times New Roman" w:eastAsia="Times New Roman" w:cs="Times New Roman"/>
+          <w:sz w:val="21"/>
+        </w:rPr>
+        <w:t xml:space="preserve"> </w:t>
+      </w:r>
+      <w:r>
+        <w:rPr>
+          <w:rFonts w:ascii="Times New Roman" w:hAnsi="Times New Roman" w:eastAsia="Times New Roman" w:cs="Times New Roman"/>
+          <w:sz w:val="21"/>
+        </w:rPr>
+        <w:t xml:space="preserve">temporal resolution, identifiers, and field definitions differ. Using</w:t>
+      </w:r>
+      <w:r>
+        <w:rPr>
+          <w:rFonts w:ascii="Times New Roman" w:hAnsi="Times New Roman" w:eastAsia="Times New Roman" w:cs="Times New Roman"/>
+          <w:sz w:val="21"/>
+        </w:rPr>
+        <w:t xml:space="preserve"> </w:t>
+      </w:r>
+      <w:r>
+        <w:rPr>
+          <w:rFonts w:ascii="Times New Roman" w:hAnsi="Times New Roman" w:eastAsia="Times New Roman" w:cs="Times New Roman"/>
+          <w:sz w:val="21"/>
+        </w:rPr>
+        <w:t xml:space="preserve">them in a common power-flow model requires topology reconstruction,</w:t>
+      </w:r>
+      <w:r>
+        <w:rPr>
+          <w:rFonts w:ascii="Times New Roman" w:hAnsi="Times New Roman" w:eastAsia="Times New Roman" w:cs="Times New Roman"/>
+          <w:sz w:val="21"/>
+        </w:rPr>
+        <w:t xml:space="preserve"> </w:t>
+      </w:r>
+      <w:r>
+        <w:rPr>
+          <w:rFonts w:ascii="Times New Roman" w:hAnsi="Times New Roman" w:eastAsia="Times New Roman" w:cs="Times New Roman"/>
+          <w:sz w:val="21"/>
+        </w:rPr>
+        <w:t xml:space="preserve">completion of electrical parameters, asset-to-bus mapping, temporal</w:t>
+      </w:r>
+      <w:r>
+        <w:rPr>
+          <w:rFonts w:ascii="Times New Roman" w:hAnsi="Times New Roman" w:eastAsia="Times New Roman" w:cs="Times New Roman"/>
+          <w:sz w:val="21"/>
+        </w:rPr>
+        <w:t xml:space="preserve"> </w:t>
+      </w:r>
+      <w:r>
+        <w:rPr>
+          <w:rFonts w:ascii="Times New Roman" w:hAnsi="Times New Roman" w:eastAsia="Times New Roman" w:cs="Times New Roman"/>
+          <w:sz w:val="21"/>
+        </w:rPr>
+        <w:t xml:space="preserve">alignment, and allocation of aggregate power to nodes.</w:t>
       </w:r>
     </w:p>
     <w:p>
@@ -919,79 +904,79 @@
           <w:sz w:val="21"/>
           <w:vertAlign w:val="superscript"/>
         </w:rPr>
+        <w:t xml:space="preserve">1</w:t>
+      </w:r>
+      <w:r>
+        <w:rPr>
+          <w:rFonts w:ascii="Times New Roman" w:hAnsi="Times New Roman" w:eastAsia="Times New Roman" w:cs="Times New Roman"/>
+          <w:sz w:val="21"/>
+        </w:rPr>
+        <w:t xml:space="preserve">; open high-voltage reconstructions focus</w:t>
+      </w:r>
+      <w:r>
+        <w:rPr>
+          <w:rFonts w:ascii="Times New Roman" w:hAnsi="Times New Roman" w:eastAsia="Times New Roman" w:cs="Times New Roman"/>
+          <w:sz w:val="21"/>
+        </w:rPr>
+        <w:t xml:space="preserve"> </w:t>
+      </w:r>
+      <w:r>
+        <w:rPr>
+          <w:rFonts w:ascii="Times New Roman" w:hAnsi="Times New Roman" w:eastAsia="Times New Roman" w:cs="Times New Roman"/>
+          <w:sz w:val="21"/>
+        </w:rPr>
+        <w:t xml:space="preserve">mainly on AC networks at 220 kV and above</w:t>
+      </w:r>
+      <w:r>
+        <w:rPr>
+          <w:rFonts w:ascii="Times New Roman" w:hAnsi="Times New Roman" w:eastAsia="Times New Roman" w:cs="Times New Roman"/>
+          <w:sz w:val="21"/>
+          <w:vertAlign w:val="superscript"/>
+        </w:rPr>
+        <w:t xml:space="preserve">3</w:t>
+      </w:r>
+      <w:r>
+        <w:rPr>
+          <w:rFonts w:ascii="Times New Roman" w:hAnsi="Times New Roman" w:eastAsia="Times New Roman" w:cs="Times New Roman"/>
+          <w:sz w:val="21"/>
+        </w:rPr>
+        <w:t xml:space="preserve">; and</w:t>
+      </w:r>
+      <w:r>
+        <w:rPr>
+          <w:rFonts w:ascii="Times New Roman" w:hAnsi="Times New Roman" w:eastAsia="Times New Roman" w:cs="Times New Roman"/>
+          <w:sz w:val="21"/>
+        </w:rPr>
+        <w:t xml:space="preserve"> </w:t>
+      </w:r>
+      <w:r>
+        <w:rPr>
+          <w:rFonts w:ascii="Times New Roman" w:hAnsi="Times New Roman" w:eastAsia="Times New Roman" w:cs="Times New Roman"/>
+          <w:sz w:val="21"/>
+        </w:rPr>
+        <w:t xml:space="preserve">representative benchmarks do not describe the geographic Portuguese</w:t>
+      </w:r>
+      <w:r>
+        <w:rPr>
+          <w:rFonts w:ascii="Times New Roman" w:hAnsi="Times New Roman" w:eastAsia="Times New Roman" w:cs="Times New Roman"/>
+          <w:sz w:val="21"/>
+        </w:rPr>
+        <w:t xml:space="preserve"> </w:t>
+      </w:r>
+      <w:r>
+        <w:rPr>
+          <w:rFonts w:ascii="Times New Roman" w:hAnsi="Times New Roman" w:eastAsia="Times New Roman" w:cs="Times New Roman"/>
+          <w:sz w:val="21"/>
+        </w:rPr>
+        <w:t xml:space="preserve">grid</w:t>
+      </w:r>
+      <w:r>
+        <w:rPr>
+          <w:rFonts w:ascii="Times New Roman" w:hAnsi="Times New Roman" w:eastAsia="Times New Roman" w:cs="Times New Roman"/>
+          <w:sz w:val="21"/>
+          <w:vertAlign w:val="superscript"/>
+        </w:rPr>
         <w:t xml:space="preserve">2</w:t>
-      </w:r>
-      <w:r>
-        <w:rPr>
-          <w:rFonts w:ascii="Times New Roman" w:hAnsi="Times New Roman" w:eastAsia="Times New Roman" w:cs="Times New Roman"/>
-          <w:sz w:val="21"/>
-        </w:rPr>
-        <w:t xml:space="preserve">; open high-voltage reconstructions focus</w:t>
-      </w:r>
-      <w:r>
-        <w:rPr>
-          <w:rFonts w:ascii="Times New Roman" w:hAnsi="Times New Roman" w:eastAsia="Times New Roman" w:cs="Times New Roman"/>
-          <w:sz w:val="21"/>
-        </w:rPr>
-        <w:t xml:space="preserve"> </w:t>
-      </w:r>
-      <w:r>
-        <w:rPr>
-          <w:rFonts w:ascii="Times New Roman" w:hAnsi="Times New Roman" w:eastAsia="Times New Roman" w:cs="Times New Roman"/>
-          <w:sz w:val="21"/>
-        </w:rPr>
-        <w:t xml:space="preserve">mainly on AC networks at 220 kV and above</w:t>
-      </w:r>
-      <w:r>
-        <w:rPr>
-          <w:rFonts w:ascii="Times New Roman" w:hAnsi="Times New Roman" w:eastAsia="Times New Roman" w:cs="Times New Roman"/>
-          <w:sz w:val="21"/>
-          <w:vertAlign w:val="superscript"/>
-        </w:rPr>
-        <w:t xml:space="preserve">4</w:t>
-      </w:r>
-      <w:r>
-        <w:rPr>
-          <w:rFonts w:ascii="Times New Roman" w:hAnsi="Times New Roman" w:eastAsia="Times New Roman" w:cs="Times New Roman"/>
-          <w:sz w:val="21"/>
-        </w:rPr>
-        <w:t xml:space="preserve">; and</w:t>
-      </w:r>
-      <w:r>
-        <w:rPr>
-          <w:rFonts w:ascii="Times New Roman" w:hAnsi="Times New Roman" w:eastAsia="Times New Roman" w:cs="Times New Roman"/>
-          <w:sz w:val="21"/>
-        </w:rPr>
-        <w:t xml:space="preserve"> </w:t>
-      </w:r>
-      <w:r>
-        <w:rPr>
-          <w:rFonts w:ascii="Times New Roman" w:hAnsi="Times New Roman" w:eastAsia="Times New Roman" w:cs="Times New Roman"/>
-          <w:sz w:val="21"/>
-        </w:rPr>
-        <w:t xml:space="preserve">representative benchmarks do not describe the geographic Portuguese</w:t>
-      </w:r>
-      <w:r>
-        <w:rPr>
-          <w:rFonts w:ascii="Times New Roman" w:hAnsi="Times New Roman" w:eastAsia="Times New Roman" w:cs="Times New Roman"/>
-          <w:sz w:val="21"/>
-        </w:rPr>
-        <w:t xml:space="preserve"> </w:t>
-      </w:r>
-      <w:r>
-        <w:rPr>
-          <w:rFonts w:ascii="Times New Roman" w:hAnsi="Times New Roman" w:eastAsia="Times New Roman" w:cs="Times New Roman"/>
-          <w:sz w:val="21"/>
-        </w:rPr>
-        <w:t xml:space="preserve">grid</w:t>
-      </w:r>
-      <w:r>
-        <w:rPr>
-          <w:rFonts w:ascii="Times New Roman" w:hAnsi="Times New Roman" w:eastAsia="Times New Roman" w:cs="Times New Roman"/>
-          <w:sz w:val="21"/>
-          <w:vertAlign w:val="superscript"/>
-        </w:rPr>
-        <w:t xml:space="preserve">3</w:t>
       </w:r>
       <w:r>
         <w:rPr>
@@ -1715,7 +1700,7 @@
           <w:sz w:val="21"/>
           <w:vertAlign w:val="superscript"/>
         </w:rPr>
-        <w:t xml:space="preserve">11</w:t>
+        <w:t xml:space="preserve">10</w:t>
       </w:r>
       <w:r>
         <w:rPr>
@@ -1758,7 +1743,7 @@
           <w:sz w:val="21"/>
           <w:vertAlign w:val="superscript"/>
         </w:rPr>
-        <w:t xml:space="preserve">8,12–14</w:t>
+        <w:t xml:space="preserve">7,11–13</w:t>
       </w:r>
       <w:r>
         <w:rPr>
@@ -1809,7 +1794,36 @@
           <w:rFonts w:ascii="Times New Roman" w:hAnsi="Times New Roman" w:eastAsia="Times New Roman" w:cs="Times New Roman"/>
           <w:sz w:val="21"/>
         </w:rPr>
-        <w:t xml:space="preserve">(PDIRT) and</w:t>
+        <w:t xml:space="preserve">(PDIRT) supplies delivery-point reference profiles</w:t>
+      </w:r>
+      <w:r>
+        <w:rPr>
+          <w:rFonts w:ascii="Times New Roman" w:hAnsi="Times New Roman" w:eastAsia="Times New Roman" w:cs="Times New Roman"/>
+          <w:sz w:val="21"/>
+          <w:vertAlign w:val="superscript"/>
+        </w:rPr>
+        <w:t xml:space="preserve">8</w:t>
+      </w:r>
+      <w:r>
+        <w:rPr>
+          <w:rFonts w:ascii="Times New Roman" w:hAnsi="Times New Roman" w:eastAsia="Times New Roman" w:cs="Times New Roman"/>
+          <w:sz w:val="21"/>
+        </w:rPr>
+        <w:t xml:space="preserve">;</w:t>
+      </w:r>
+      <w:r>
+        <w:rPr>
+          <w:rFonts w:ascii="Times New Roman" w:hAnsi="Times New Roman" w:eastAsia="Times New Roman" w:cs="Times New Roman"/>
+          <w:sz w:val="21"/>
+        </w:rPr>
+        <w:t xml:space="preserve"> </w:t>
+      </w:r>
+      <w:r>
+        <w:rPr>
+          <w:rFonts w:ascii="Times New Roman" w:hAnsi="Times New Roman" w:eastAsia="Times New Roman" w:cs="Times New Roman"/>
+          <w:sz w:val="21"/>
+        </w:rPr>
+        <w:t xml:space="preserve">the</w:t>
       </w:r>
       <w:r>
         <w:rPr>
@@ -1825,7 +1839,7 @@
           <w:iCs/>
           <w:sz w:val="21"/>
         </w:rPr>
-        <w:t xml:space="preserve">Plano de Desenvolvimento e Investimento da Rede</w:t>
+        <w:t xml:space="preserve">Plano de Desenvolvimento e Investimento da Rede Nacional de</w:t>
       </w:r>
       <w:r>
         <w:rPr>
@@ -1843,35 +1857,35 @@
           <w:iCs/>
           <w:sz w:val="21"/>
         </w:rPr>
-        <w:t xml:space="preserve">Nacional de Distribuição</w:t>
-      </w:r>
-      <w:r>
-        <w:rPr>
-          <w:rFonts w:ascii="Times New Roman" w:hAnsi="Times New Roman" w:eastAsia="Times New Roman" w:cs="Times New Roman"/>
-          <w:sz w:val="21"/>
-        </w:rPr>
-        <w:t xml:space="preserve"> </w:t>
-      </w:r>
-      <w:r>
-        <w:rPr>
-          <w:rFonts w:ascii="Times New Roman" w:hAnsi="Times New Roman" w:eastAsia="Times New Roman" w:cs="Times New Roman"/>
-          <w:sz w:val="21"/>
-        </w:rPr>
-        <w:t xml:space="preserve">(PDIRD) provide delivery-point profiles and</w:t>
-      </w:r>
-      <w:r>
-        <w:rPr>
-          <w:rFonts w:ascii="Times New Roman" w:hAnsi="Times New Roman" w:eastAsia="Times New Roman" w:cs="Times New Roman"/>
-          <w:sz w:val="21"/>
-        </w:rPr>
-        <w:t xml:space="preserve"> </w:t>
-      </w:r>
-      <w:r>
-        <w:rPr>
-          <w:rFonts w:ascii="Times New Roman" w:hAnsi="Times New Roman" w:eastAsia="Times New Roman" w:cs="Times New Roman"/>
-          <w:sz w:val="21"/>
-        </w:rPr>
-        <w:t xml:space="preserve">selected equipment parameters</w:t>
+        <w:t xml:space="preserve">Distribuição</w:t>
+      </w:r>
+      <w:r>
+        <w:rPr>
+          <w:rFonts w:ascii="Times New Roman" w:hAnsi="Times New Roman" w:eastAsia="Times New Roman" w:cs="Times New Roman"/>
+          <w:sz w:val="21"/>
+        </w:rPr>
+        <w:t xml:space="preserve"> </w:t>
+      </w:r>
+      <w:r>
+        <w:rPr>
+          <w:rFonts w:ascii="Times New Roman" w:hAnsi="Times New Roman" w:eastAsia="Times New Roman" w:cs="Times New Roman"/>
+          <w:sz w:val="21"/>
+        </w:rPr>
+        <w:t xml:space="preserve">(PDIRD) supplies distribution-circuit inventory and</w:t>
+      </w:r>
+      <w:r>
+        <w:rPr>
+          <w:rFonts w:ascii="Times New Roman" w:hAnsi="Times New Roman" w:eastAsia="Times New Roman" w:cs="Times New Roman"/>
+          <w:sz w:val="21"/>
+        </w:rPr>
+        <w:t xml:space="preserve"> </w:t>
+      </w:r>
+      <w:r>
+        <w:rPr>
+          <w:rFonts w:ascii="Times New Roman" w:hAnsi="Times New Roman" w:eastAsia="Times New Roman" w:cs="Times New Roman"/>
+          <w:sz w:val="21"/>
+        </w:rPr>
+        <w:t xml:space="preserve">parameter evidence</w:t>
       </w:r>
       <w:r>
         <w:rPr>
@@ -1879,42 +1893,42 @@
           <w:sz w:val="21"/>
           <w:vertAlign w:val="superscript"/>
         </w:rPr>
-        <w:t xml:space="preserve">6,7,9,10</w:t>
-      </w:r>
-      <w:r>
-        <w:rPr>
-          <w:rFonts w:ascii="Times New Roman" w:hAnsi="Times New Roman" w:eastAsia="Times New Roman" w:cs="Times New Roman"/>
-          <w:sz w:val="21"/>
-        </w:rPr>
-        <w:t xml:space="preserve">. The European</w:t>
-      </w:r>
-      <w:r>
-        <w:rPr>
-          <w:rFonts w:ascii="Times New Roman" w:hAnsi="Times New Roman" w:eastAsia="Times New Roman" w:cs="Times New Roman"/>
-          <w:sz w:val="21"/>
-        </w:rPr>
-        <w:t xml:space="preserve"> </w:t>
-      </w:r>
-      <w:r>
-        <w:rPr>
-          <w:rFonts w:ascii="Times New Roman" w:hAnsi="Times New Roman" w:eastAsia="Times New Roman" w:cs="Times New Roman"/>
-          <w:sz w:val="21"/>
-        </w:rPr>
-        <w:t xml:space="preserve">Commission’s Geographical Information System (GISCO) supplies the</w:t>
-      </w:r>
-      <w:r>
-        <w:rPr>
-          <w:rFonts w:ascii="Times New Roman" w:hAnsi="Times New Roman" w:eastAsia="Times New Roman" w:cs="Times New Roman"/>
-          <w:sz w:val="21"/>
-        </w:rPr>
-        <w:t xml:space="preserve"> </w:t>
-      </w:r>
-      <w:r>
-        <w:rPr>
-          <w:rFonts w:ascii="Times New Roman" w:hAnsi="Times New Roman" w:eastAsia="Times New Roman" w:cs="Times New Roman"/>
-          <w:sz w:val="21"/>
-        </w:rPr>
-        <w:t xml:space="preserve">continental boundary</w:t>
+        <w:t xml:space="preserve">14</w:t>
+      </w:r>
+      <w:r>
+        <w:rPr>
+          <w:rFonts w:ascii="Times New Roman" w:hAnsi="Times New Roman" w:eastAsia="Times New Roman" w:cs="Times New Roman"/>
+          <w:sz w:val="21"/>
+        </w:rPr>
+        <w:t xml:space="preserve">. The European Commission’s</w:t>
+      </w:r>
+      <w:r>
+        <w:rPr>
+          <w:rFonts w:ascii="Times New Roman" w:hAnsi="Times New Roman" w:eastAsia="Times New Roman" w:cs="Times New Roman"/>
+          <w:sz w:val="21"/>
+        </w:rPr>
+        <w:t xml:space="preserve"> </w:t>
+      </w:r>
+      <w:r>
+        <w:rPr>
+          <w:rFonts w:ascii="Times New Roman" w:hAnsi="Times New Roman" w:eastAsia="Times New Roman" w:cs="Times New Roman"/>
+          <w:sz w:val="21"/>
+        </w:rPr>
+        <w:t xml:space="preserve">Geographical Information System (GISCO) supplies the continental</w:t>
+      </w:r>
+      <w:r>
+        <w:rPr>
+          <w:rFonts w:ascii="Times New Roman" w:hAnsi="Times New Roman" w:eastAsia="Times New Roman" w:cs="Times New Roman"/>
+          <w:sz w:val="21"/>
+        </w:rPr>
+        <w:t xml:space="preserve"> </w:t>
+      </w:r>
+      <w:r>
+        <w:rPr>
+          <w:rFonts w:ascii="Times New Roman" w:hAnsi="Times New Roman" w:eastAsia="Times New Roman" w:cs="Times New Roman"/>
+          <w:sz w:val="21"/>
+        </w:rPr>
+        <w:t xml:space="preserve">boundary</w:t>
       </w:r>
       <w:r>
         <w:rPr>
@@ -1929,21 +1943,21 @@
           <w:rFonts w:ascii="Times New Roman" w:hAnsi="Times New Roman" w:eastAsia="Times New Roman" w:cs="Times New Roman"/>
           <w:sz w:val="21"/>
         </w:rPr>
-        <w:t xml:space="preserve">; REN and Red Eléctrica de</w:t>
-      </w:r>
-      <w:r>
-        <w:rPr>
-          <w:rFonts w:ascii="Times New Roman" w:hAnsi="Times New Roman" w:eastAsia="Times New Roman" w:cs="Times New Roman"/>
-          <w:sz w:val="21"/>
-        </w:rPr>
-        <w:t xml:space="preserve"> </w:t>
-      </w:r>
-      <w:r>
-        <w:rPr>
-          <w:rFonts w:ascii="Times New Roman" w:hAnsi="Times New Roman" w:eastAsia="Times New Roman" w:cs="Times New Roman"/>
-          <w:sz w:val="21"/>
-        </w:rPr>
-        <w:t xml:space="preserve">España (REE) records support transmission and interconnection</w:t>
+        <w:t xml:space="preserve">; REN and Red Eléctrica de España (REE)</w:t>
+      </w:r>
+      <w:r>
+        <w:rPr>
+          <w:rFonts w:ascii="Times New Roman" w:hAnsi="Times New Roman" w:eastAsia="Times New Roman" w:cs="Times New Roman"/>
+          <w:sz w:val="21"/>
+        </w:rPr>
+        <w:t xml:space="preserve"> </w:t>
+      </w:r>
+      <w:r>
+        <w:rPr>
+          <w:rFonts w:ascii="Times New Roman" w:hAnsi="Times New Roman" w:eastAsia="Times New Roman" w:cs="Times New Roman"/>
+          <w:sz w:val="21"/>
+        </w:rPr>
+        <w:t xml:space="preserve">records support transmission and interconnection</w:t>
       </w:r>
       <w:r>
         <w:rPr>
@@ -4371,49 +4385,35 @@
           <w:rFonts w:ascii="Times New Roman" w:hAnsi="Times New Roman" w:eastAsia="Times New Roman" w:cs="Times New Roman"/>
           <w:sz w:val="21"/>
         </w:rPr>
-        <w:t xml:space="preserve">and every derived object retains source keys and processing status.</w:t>
-      </w:r>
-      <w:r>
-        <w:rPr>
-          <w:rFonts w:ascii="Times New Roman" w:hAnsi="Times New Roman" w:eastAsia="Times New Roman" w:cs="Times New Roman"/>
-          <w:sz w:val="21"/>
-        </w:rPr>
-        <w:t xml:space="preserve"> </w:t>
-      </w:r>
-      <w:r>
-        <w:rPr>
-          <w:rFonts w:ascii="Times New Roman" w:hAnsi="Times New Roman" w:eastAsia="Times New Roman" w:cs="Times New Roman"/>
-          <w:sz w:val="21"/>
-        </w:rPr>
-        <w:t xml:space="preserve">Table 3 summarizes the principal transformations; the released data</w:t>
-      </w:r>
-      <w:r>
-        <w:rPr>
-          <w:rFonts w:ascii="Times New Roman" w:hAnsi="Times New Roman" w:eastAsia="Times New Roman" w:cs="Times New Roman"/>
-          <w:sz w:val="21"/>
-        </w:rPr>
-        <w:t xml:space="preserve"> </w:t>
-      </w:r>
-      <w:r>
-        <w:rPr>
-          <w:rFonts w:ascii="Times New Roman" w:hAnsi="Times New Roman" w:eastAsia="Times New Roman" w:cs="Times New Roman"/>
-          <w:sz w:val="21"/>
-        </w:rPr>
-        <w:t xml:space="preserve">dictionary maps each source field to its standardized meaning,</w:t>
-      </w:r>
-      <w:r>
-        <w:rPr>
-          <w:rFonts w:ascii="Times New Roman" w:hAnsi="Times New Roman" w:eastAsia="Times New Roman" w:cs="Times New Roman"/>
-          <w:sz w:val="21"/>
-        </w:rPr>
-        <w:t xml:space="preserve"> </w:t>
-      </w:r>
-      <w:r>
-        <w:rPr>
-          <w:rFonts w:ascii="Times New Roman" w:hAnsi="Times New Roman" w:eastAsia="Times New Roman" w:cs="Times New Roman"/>
-          <w:sz w:val="21"/>
-        </w:rPr>
-        <w:t xml:space="preserve">transformation, join key, and missing-data rule.</w:t>
+        <w:t xml:space="preserve">and every derived object retains source keys and processing status. The</w:t>
+      </w:r>
+      <w:r>
+        <w:rPr>
+          <w:rFonts w:ascii="Times New Roman" w:hAnsi="Times New Roman" w:eastAsia="Times New Roman" w:cs="Times New Roman"/>
+          <w:sz w:val="21"/>
+        </w:rPr>
+        <w:t xml:space="preserve"> </w:t>
+      </w:r>
+      <w:r>
+        <w:rPr>
+          <w:rFonts w:ascii="Times New Roman" w:hAnsi="Times New Roman" w:eastAsia="Times New Roman" w:cs="Times New Roman"/>
+          <w:sz w:val="21"/>
+        </w:rPr>
+        <w:t xml:space="preserve">released data dictionary maps each source field to its standardized</w:t>
+      </w:r>
+      <w:r>
+        <w:rPr>
+          <w:rFonts w:ascii="Times New Roman" w:hAnsi="Times New Roman" w:eastAsia="Times New Roman" w:cs="Times New Roman"/>
+          <w:sz w:val="21"/>
+        </w:rPr>
+        <w:t xml:space="preserve"> </w:t>
+      </w:r>
+      <w:r>
+        <w:rPr>
+          <w:rFonts w:ascii="Times New Roman" w:hAnsi="Times New Roman" w:eastAsia="Times New Roman" w:cs="Times New Roman"/>
+          <w:sz w:val="21"/>
+        </w:rPr>
+        <w:t xml:space="preserve">meaning, transformation, join key, and missing-data rule.</w:t>
       </w:r>
     </w:p>
     <w:bookmarkEnd w:id="24"/>
@@ -5138,7 +5138,7 @@
           <w:sz w:val="21"/>
           <w:vertAlign w:val="superscript"/>
         </w:rPr>
-        <w:t xml:space="preserve">7</w:t>
+        <w:t xml:space="preserve">6</w:t>
       </w:r>
       <w:r>
         <w:rPr>
@@ -5296,92 +5296,92 @@
           <w:sz w:val="21"/>
           <w:vertAlign w:val="superscript"/>
         </w:rPr>
+        <w:t xml:space="preserve">14</w:t>
+      </w:r>
+      <w:r>
+        <w:rPr>
+          <w:rFonts w:ascii="Times New Roman" w:hAnsi="Times New Roman" w:eastAsia="Times New Roman" w:cs="Times New Roman"/>
+          <w:sz w:val="21"/>
+        </w:rPr>
+        <w:t xml:space="preserve">. Remaining</w:t>
+      </w:r>
+      <w:r>
+        <w:rPr>
+          <w:rFonts w:ascii="Times New Roman" w:hAnsi="Times New Roman" w:eastAsia="Times New Roman" w:cs="Times New Roman"/>
+          <w:sz w:val="21"/>
+        </w:rPr>
+        <w:t xml:space="preserve"> </w:t>
+      </w:r>
+      <w:r>
+        <w:rPr>
+          <w:rFonts w:ascii="Times New Roman" w:hAnsi="Times New Roman" w:eastAsia="Times New Roman" w:cs="Times New Roman"/>
+          <w:sz w:val="21"/>
+        </w:rPr>
+        <w:t xml:space="preserve">lines use voltage-class defaults and cable correction factors. Each</w:t>
+      </w:r>
+      <w:r>
+        <w:rPr>
+          <w:rFonts w:ascii="Times New Roman" w:hAnsi="Times New Roman" w:eastAsia="Times New Roman" w:cs="Times New Roman"/>
+          <w:sz w:val="21"/>
+        </w:rPr>
+        <w:t xml:space="preserve"> </w:t>
+      </w:r>
+      <w:r>
+        <w:rPr>
+          <w:rFonts w:ascii="Times New Roman" w:hAnsi="Times New Roman" w:eastAsia="Times New Roman" w:cs="Times New Roman"/>
+          <w:sz w:val="21"/>
+        </w:rPr>
+        <w:t xml:space="preserve">parameter is labelled as directly published, derived from public</w:t>
+      </w:r>
+      <w:r>
+        <w:rPr>
+          <w:rFonts w:ascii="Times New Roman" w:hAnsi="Times New Roman" w:eastAsia="Times New Roman" w:cs="Times New Roman"/>
+          <w:sz w:val="21"/>
+        </w:rPr>
+        <w:t xml:space="preserve"> </w:t>
+      </w:r>
+      <w:r>
+        <w:rPr>
+          <w:rFonts w:ascii="Times New Roman" w:hAnsi="Times New Roman" w:eastAsia="Times New Roman" w:cs="Times New Roman"/>
+          <w:sz w:val="21"/>
+        </w:rPr>
+        <w:t xml:space="preserve">documentation, aggregate-calibrated, or an engineering proxy. Some</w:t>
+      </w:r>
+      <w:r>
+        <w:rPr>
+          <w:rFonts w:ascii="Times New Roman" w:hAnsi="Times New Roman" w:eastAsia="Times New Roman" w:cs="Times New Roman"/>
+          <w:sz w:val="21"/>
+        </w:rPr>
+        <w:t xml:space="preserve"> </w:t>
+      </w:r>
+      <w:r>
+        <w:rPr>
+          <w:rFonts w:ascii="Times New Roman" w:hAnsi="Times New Roman" w:eastAsia="Times New Roman" w:cs="Times New Roman"/>
+          <w:sz w:val="21"/>
+        </w:rPr>
+        <w:t xml:space="preserve">resistance support is transferred from conductor parameters reported in</w:t>
+      </w:r>
+      <w:r>
+        <w:rPr>
+          <w:rFonts w:ascii="Times New Roman" w:hAnsi="Times New Roman" w:eastAsia="Times New Roman" w:cs="Times New Roman"/>
+          <w:sz w:val="21"/>
+        </w:rPr>
+        <w:t xml:space="preserve"> </w:t>
+      </w:r>
+      <w:r>
+        <w:rPr>
+          <w:rFonts w:ascii="Times New Roman" w:hAnsi="Times New Roman" w:eastAsia="Times New Roman" w:cs="Times New Roman"/>
+          <w:sz w:val="21"/>
+        </w:rPr>
+        <w:t xml:space="preserve">project documentation</w:t>
+      </w:r>
+      <w:r>
+        <w:rPr>
+          <w:rFonts w:ascii="Times New Roman" w:hAnsi="Times New Roman" w:eastAsia="Times New Roman" w:cs="Times New Roman"/>
+          <w:sz w:val="21"/>
+          <w:vertAlign w:val="superscript"/>
+        </w:rPr>
         <w:t xml:space="preserve">19</w:t>
-      </w:r>
-      <w:r>
-        <w:rPr>
-          <w:rFonts w:ascii="Times New Roman" w:hAnsi="Times New Roman" w:eastAsia="Times New Roman" w:cs="Times New Roman"/>
-          <w:sz w:val="21"/>
-        </w:rPr>
-        <w:t xml:space="preserve">. Remaining</w:t>
-      </w:r>
-      <w:r>
-        <w:rPr>
-          <w:rFonts w:ascii="Times New Roman" w:hAnsi="Times New Roman" w:eastAsia="Times New Roman" w:cs="Times New Roman"/>
-          <w:sz w:val="21"/>
-        </w:rPr>
-        <w:t xml:space="preserve"> </w:t>
-      </w:r>
-      <w:r>
-        <w:rPr>
-          <w:rFonts w:ascii="Times New Roman" w:hAnsi="Times New Roman" w:eastAsia="Times New Roman" w:cs="Times New Roman"/>
-          <w:sz w:val="21"/>
-        </w:rPr>
-        <w:t xml:space="preserve">lines use voltage-class defaults and cable correction factors. Each</w:t>
-      </w:r>
-      <w:r>
-        <w:rPr>
-          <w:rFonts w:ascii="Times New Roman" w:hAnsi="Times New Roman" w:eastAsia="Times New Roman" w:cs="Times New Roman"/>
-          <w:sz w:val="21"/>
-        </w:rPr>
-        <w:t xml:space="preserve"> </w:t>
-      </w:r>
-      <w:r>
-        <w:rPr>
-          <w:rFonts w:ascii="Times New Roman" w:hAnsi="Times New Roman" w:eastAsia="Times New Roman" w:cs="Times New Roman"/>
-          <w:sz w:val="21"/>
-        </w:rPr>
-        <w:t xml:space="preserve">parameter is labelled as directly published, derived from public</w:t>
-      </w:r>
-      <w:r>
-        <w:rPr>
-          <w:rFonts w:ascii="Times New Roman" w:hAnsi="Times New Roman" w:eastAsia="Times New Roman" w:cs="Times New Roman"/>
-          <w:sz w:val="21"/>
-        </w:rPr>
-        <w:t xml:space="preserve"> </w:t>
-      </w:r>
-      <w:r>
-        <w:rPr>
-          <w:rFonts w:ascii="Times New Roman" w:hAnsi="Times New Roman" w:eastAsia="Times New Roman" w:cs="Times New Roman"/>
-          <w:sz w:val="21"/>
-        </w:rPr>
-        <w:t xml:space="preserve">documentation, aggregate-calibrated, or an engineering proxy. Some</w:t>
-      </w:r>
-      <w:r>
-        <w:rPr>
-          <w:rFonts w:ascii="Times New Roman" w:hAnsi="Times New Roman" w:eastAsia="Times New Roman" w:cs="Times New Roman"/>
-          <w:sz w:val="21"/>
-        </w:rPr>
-        <w:t xml:space="preserve"> </w:t>
-      </w:r>
-      <w:r>
-        <w:rPr>
-          <w:rFonts w:ascii="Times New Roman" w:hAnsi="Times New Roman" w:eastAsia="Times New Roman" w:cs="Times New Roman"/>
-          <w:sz w:val="21"/>
-        </w:rPr>
-        <w:t xml:space="preserve">resistance support is transferred from conductor parameters reported in</w:t>
-      </w:r>
-      <w:r>
-        <w:rPr>
-          <w:rFonts w:ascii="Times New Roman" w:hAnsi="Times New Roman" w:eastAsia="Times New Roman" w:cs="Times New Roman"/>
-          <w:sz w:val="21"/>
-        </w:rPr>
-        <w:t xml:space="preserve"> </w:t>
-      </w:r>
-      <w:r>
-        <w:rPr>
-          <w:rFonts w:ascii="Times New Roman" w:hAnsi="Times New Roman" w:eastAsia="Times New Roman" w:cs="Times New Roman"/>
-          <w:sz w:val="21"/>
-        </w:rPr>
-        <w:t xml:space="preserve">project documentation</w:t>
-      </w:r>
-      <w:r>
-        <w:rPr>
-          <w:rFonts w:ascii="Times New Roman" w:hAnsi="Times New Roman" w:eastAsia="Times New Roman" w:cs="Times New Roman"/>
-          <w:sz w:val="21"/>
-          <w:vertAlign w:val="superscript"/>
-        </w:rPr>
-        <w:t xml:space="preserve">20</w:t>
       </w:r>
       <w:r>
         <w:rPr>
@@ -9139,7 +9139,7 @@
           <w:sz w:val="21"/>
           <w:vertAlign w:val="superscript"/>
         </w:rPr>
-        <w:t xml:space="preserve">9</w:t>
+        <w:t xml:space="preserve">8</w:t>
       </w:r>
       <w:r>
         <w:rPr>
@@ -12900,7 +12900,7 @@
           <w:sz w:val="21"/>
           <w:vertAlign w:val="superscript"/>
         </w:rPr>
-        <w:t xml:space="preserve">1</w:t>
+        <w:t xml:space="preserve">20</w:t>
       </w:r>
       <w:r>
         <w:rPr>
@@ -22138,35 +22138,35 @@
           <w:rFonts w:ascii="Times New Roman" w:hAnsi="Times New Roman" w:eastAsia="Times New Roman" w:cs="Times New Roman"/>
           <w:sz w:val="21"/>
         </w:rPr>
-        <w:t xml:space="preserve">. This</w:t>
-      </w:r>
-      <w:r>
-        <w:rPr>
-          <w:rFonts w:ascii="Times New Roman" w:hAnsi="Times New Roman" w:eastAsia="Times New Roman" w:cs="Times New Roman"/>
-          <w:sz w:val="21"/>
-        </w:rPr>
-        <w:t xml:space="preserve"> </w:t>
-      </w:r>
-      <w:r>
-        <w:rPr>
-          <w:rFonts w:ascii="Times New Roman" w:hAnsi="Times New Roman" w:eastAsia="Times New Roman" w:cs="Times New Roman"/>
-          <w:sz w:val="21"/>
-        </w:rPr>
-        <w:t xml:space="preserve">overall classification differs from field-level support, which Figure 3</w:t>
-      </w:r>
-      <w:r>
-        <w:rPr>
-          <w:rFonts w:ascii="Times New Roman" w:hAnsi="Times New Roman" w:eastAsia="Times New Roman" w:cs="Times New Roman"/>
-          <w:sz w:val="21"/>
-        </w:rPr>
-        <w:t xml:space="preserve"> </w:t>
-      </w:r>
-      <w:r>
-        <w:rPr>
-          <w:rFonts w:ascii="Times New Roman" w:hAnsi="Times New Roman" w:eastAsia="Times New Roman" w:cs="Times New Roman"/>
-          <w:sz w:val="21"/>
-        </w:rPr>
-        <w:t xml:space="preserve">reports separately.</w:t>
+        <w:t xml:space="preserve">. Table</w:t>
+      </w:r>
+      <w:r>
+        <w:rPr>
+          <w:rFonts w:ascii="Times New Roman" w:hAnsi="Times New Roman" w:eastAsia="Times New Roman" w:cs="Times New Roman"/>
+          <w:sz w:val="21"/>
+        </w:rPr>
+        <w:t xml:space="preserve"> </w:t>
+      </w:r>
+      <w:r>
+        <w:rPr>
+          <w:rFonts w:ascii="Times New Roman" w:hAnsi="Times New Roman" w:eastAsia="Times New Roman" w:cs="Times New Roman"/>
+          <w:sz w:val="21"/>
+        </w:rPr>
+        <w:t xml:space="preserve">6 gives these line-level counts alongside network structure and</w:t>
+      </w:r>
+      <w:r>
+        <w:rPr>
+          <w:rFonts w:ascii="Times New Roman" w:hAnsi="Times New Roman" w:eastAsia="Times New Roman" w:cs="Times New Roman"/>
+          <w:sz w:val="21"/>
+        </w:rPr>
+        <w:t xml:space="preserve"> </w:t>
+      </w:r>
+      <w:r>
+        <w:rPr>
+          <w:rFonts w:ascii="Times New Roman" w:hAnsi="Times New Roman" w:eastAsia="Times New Roman" w:cs="Times New Roman"/>
+          <w:sz w:val="21"/>
+        </w:rPr>
+        <w:t xml:space="preserve">route-length comparisons; Figure 3 separately shows field-level support.</w:t>
       </w:r>
     </w:p>
     <w:p>
@@ -22288,7 +22288,7 @@
           <wp:inline>
             <wp:extent cx="5623560" cy="2616516"/>
             <wp:effectExtent b="0" l="0" r="0" t="0"/>
-            <wp:docPr descr="Figure 3—Structural coverage and field-level parameter evidence. (a) Model route-km divided by public background length for each voltage class; the dashed line marks unity. Grey circles use non-independent OSM context and blue squares use REN background. Route-km and circuit length have different definitions, so the ratio is not an accuracy measure. (b) Field-level separation of project-based resistance transfer (orange; engineering assumption) and source-backed ratings (green); cells show proportions. Grey denotes wholly proxy fields. The 35.8% resistance support is not direct observation and must not be assigned the same evidence level as ratings. Reactance and capacitance are proxies throughout. The 130 kV result contains seven lines and is descriptive only. Table 6 reports line-level evidence counts." title="Figure 3" id="55" name="Picture"/>
+            <wp:docPr descr="Figure 3—Structural coverage and field-level parameter evidence. (a) Model route-km divided by public background length for each voltage class; the dashed line marks unity. Grey circles use non-independent OSM context and blue squares use REN background. Route-km and circuit length have different definitions, so the ratio is not an accuracy measure. (b) Field-level separation of project-based resistance transfer (orange; engineering assumption) and source-backed ratings (green); cells show proportions. Grey denotes wholly proxy fields. The 35.8% resistance support is not direct observation and must not be assigned the same evidence level as ratings. Reactance and capacitance are proxies throughout. The 130 kV result contains seven lines and is descriptive only." title="Figure 3" id="55" name="Picture"/>
             <a:graphic>
               <a:graphicData uri="http://schemas.openxmlformats.org/drawingml/2006/picture">
                 <pic:pic>
@@ -22511,21 +22511,7 @@
           <w:rFonts w:ascii="Times New Roman" w:hAnsi="Times New Roman" w:eastAsia="Times New Roman" w:cs="Times New Roman"/>
           <w:sz w:val="18"/>
         </w:rPr>
-        <w:t xml:space="preserve">lines and is descriptive only. Table 6 reports line-level evidence</w:t>
-      </w:r>
-      <w:r>
-        <w:rPr>
-          <w:rFonts w:ascii="Times New Roman" w:hAnsi="Times New Roman" w:eastAsia="Times New Roman" w:cs="Times New Roman"/>
-          <w:sz w:val="18"/>
-        </w:rPr>
-        <w:t xml:space="preserve"> </w:t>
-      </w:r>
-      <w:r>
-        <w:rPr>
-          <w:rFonts w:ascii="Times New Roman" w:hAnsi="Times New Roman" w:eastAsia="Times New Roman" w:cs="Times New Roman"/>
-          <w:sz w:val="18"/>
-        </w:rPr>
-        <w:t xml:space="preserve">counts.</w:t>
+        <w:t xml:space="preserve">lines and is descriptive only.</w:t>
       </w:r>
     </w:p>
     <w:p>
@@ -25054,7 +25040,7 @@
           <wp:inline>
             <wp:extent cx="5623560" cy="5467349"/>
             <wp:effectExtent b="0" l="0" r="0" t="0"/>
-            <wp:docPr descr="Figure 5—External temporal validation of aggregate inputs. (a–b) Paired daily means for national consumption and wind; (c–d) density of the corresponding 31,388 and 31,484 15-minute pairs, with a shared logarithmic count scale, one-to-one line, and Pearson ; and (e) consumption profiles grouped by Lisbon local time and normalized by each series’ daily mean. Comparisons exclude only intervals missing a required field and use no anomaly deletion, smoothing, or interpolation. Consumption excludes pumping and battery charging and differs from total electric load in the cases. Wind compares national production with distribution-grid injection across different scopes. The figure validates aggregate inputs, not nodal allocation or branch flow. Table 7 gives bootstrap intervals." title="Figure 5" id="63" name="Picture"/>
+            <wp:docPr descr="Figure 5—External temporal validation of aggregate inputs. (a–b) Paired daily means for national consumption and wind; (c–d) density of the corresponding 31,388 and 31,484 15-minute pairs, with a shared logarithmic count scale, one-to-one line, and Pearson ; and (e) consumption profiles grouped by Lisbon local time and normalized by each series’ daily mean. Comparisons exclude only intervals missing a required field and use no anomaly deletion, smoothing, or interpolation. Consumption excludes pumping and battery charging and differs from total electric load in the cases. Wind compares national production with distribution-grid injection across different scopes. The figure validates aggregate inputs, not nodal allocation or branch flow." title="Figure 5" id="63" name="Picture"/>
             <a:graphic>
               <a:graphicData uri="http://schemas.openxmlformats.org/drawingml/2006/picture">
                 <pic:pic>
@@ -25264,21 +25250,7 @@
           <w:rFonts w:ascii="Times New Roman" w:hAnsi="Times New Roman" w:eastAsia="Times New Roman" w:cs="Times New Roman"/>
           <w:sz w:val="18"/>
         </w:rPr>
-        <w:t xml:space="preserve">validates aggregate inputs, not nodal allocation or branch flow. Table 7</w:t>
-      </w:r>
-      <w:r>
-        <w:rPr>
-          <w:rFonts w:ascii="Times New Roman" w:hAnsi="Times New Roman" w:eastAsia="Times New Roman" w:cs="Times New Roman"/>
-          <w:sz w:val="18"/>
-        </w:rPr>
-        <w:t xml:space="preserve"> </w:t>
-      </w:r>
-      <w:r>
-        <w:rPr>
-          <w:rFonts w:ascii="Times New Roman" w:hAnsi="Times New Roman" w:eastAsia="Times New Roman" w:cs="Times New Roman"/>
-          <w:sz w:val="18"/>
-        </w:rPr>
-        <w:t xml:space="preserve">gives bootstrap intervals.</w:t>
+        <w:t xml:space="preserve">validates aggregate inputs, not nodal allocation or branch flow.</w:t>
       </w:r>
     </w:p>
     <w:bookmarkEnd w:id="65"/>
@@ -30275,7 +30247,7 @@
           <w:rFonts w:ascii="Times New Roman" w:hAnsi="Times New Roman" w:eastAsia="Times New Roman" w:cs="Times New Roman"/>
           <w:sz w:val="16"/>
         </w:rPr>
-        <w:t xml:space="preserve">Thurner, L.</w:t>
+        <w:t xml:space="preserve">Hörsch, J., Hofmann, F., Schlachtberger, D. &amp; Brown, T.</w:t>
       </w:r>
       <w:r>
         <w:rPr>
@@ -30284,284 +30256,7 @@
         </w:rPr>
         <w:t xml:space="preserve"> </w:t>
       </w:r>
-      <w:r>
-        <w:rPr>
-          <w:rFonts w:ascii="Times New Roman" w:hAnsi="Times New Roman" w:eastAsia="Times New Roman" w:cs="Times New Roman"/>
-          <w:i/>
-          <w:iCs/>
-          <w:sz w:val="16"/>
-        </w:rPr>
-        <w:t xml:space="preserve">et al.</w:t>
-      </w:r>
-      <w:r>
-        <w:rPr>
-          <w:rFonts w:ascii="Times New Roman" w:hAnsi="Times New Roman" w:eastAsia="Times New Roman" w:cs="Times New Roman"/>
-          <w:sz w:val="16"/>
-        </w:rPr>
-        <w:t xml:space="preserve"> </w:t>
-      </w:r>
       <w:hyperlink r:id="rId82">
-        <w:r>
-          <w:rPr>
-            <w:rStyle w:val="Hyperlink"/>
-          </w:rPr>
-          <w:t xml:space="preserve">Pandapower—an</w:t>
-        </w:r>
-        <w:r>
-          <w:rPr>
-            <w:rStyle w:val="Hyperlink"/>
-          </w:rPr>
-          <w:t xml:space="preserve"> </w:t>
-        </w:r>
-        <w:r>
-          <w:rPr>
-            <w:rStyle w:val="Hyperlink"/>
-          </w:rPr>
-          <w:t xml:space="preserve">Open-Source</w:t>
-        </w:r>
-        <w:r>
-          <w:rPr>
-            <w:rStyle w:val="Hyperlink"/>
-          </w:rPr>
-          <w:t xml:space="preserve"> </w:t>
-        </w:r>
-        <w:r>
-          <w:rPr>
-            <w:rStyle w:val="Hyperlink"/>
-          </w:rPr>
-          <w:t xml:space="preserve">Python</w:t>
-        </w:r>
-        <w:r>
-          <w:rPr>
-            <w:rStyle w:val="Hyperlink"/>
-          </w:rPr>
-          <w:t xml:space="preserve"> </w:t>
-        </w:r>
-        <w:r>
-          <w:rPr>
-            <w:rStyle w:val="Hyperlink"/>
-          </w:rPr>
-          <w:t xml:space="preserve">Tool</w:t>
-        </w:r>
-        <w:r>
-          <w:rPr>
-            <w:rStyle w:val="Hyperlink"/>
-          </w:rPr>
-          <w:t xml:space="preserve"> </w:t>
-        </w:r>
-        <w:r>
-          <w:rPr>
-            <w:rStyle w:val="Hyperlink"/>
-          </w:rPr>
-          <w:t xml:space="preserve">for</w:t>
-        </w:r>
-        <w:r>
-          <w:rPr>
-            <w:rStyle w:val="Hyperlink"/>
-          </w:rPr>
-          <w:t xml:space="preserve"> </w:t>
-        </w:r>
-        <w:r>
-          <w:rPr>
-            <w:rStyle w:val="Hyperlink"/>
-          </w:rPr>
-          <w:t xml:space="preserve">Convenient</w:t>
-        </w:r>
-        <w:r>
-          <w:rPr>
-            <w:rStyle w:val="Hyperlink"/>
-          </w:rPr>
-          <w:t xml:space="preserve"> </w:t>
-        </w:r>
-        <w:r>
-          <w:rPr>
-            <w:rStyle w:val="Hyperlink"/>
-          </w:rPr>
-          <w:t xml:space="preserve">Modeling,</w:t>
-        </w:r>
-        <w:r>
-          <w:rPr>
-            <w:rStyle w:val="Hyperlink"/>
-          </w:rPr>
-          <w:t xml:space="preserve"> </w:t>
-        </w:r>
-        <w:r>
-          <w:rPr>
-            <w:rStyle w:val="Hyperlink"/>
-          </w:rPr>
-          <w:t xml:space="preserve">Analysis,</w:t>
-        </w:r>
-        <w:r>
-          <w:rPr>
-            <w:rStyle w:val="Hyperlink"/>
-          </w:rPr>
-          <w:t xml:space="preserve"> </w:t>
-        </w:r>
-        <w:r>
-          <w:rPr>
-            <w:rStyle w:val="Hyperlink"/>
-          </w:rPr>
-          <w:t xml:space="preserve">and</w:t>
-        </w:r>
-        <w:r>
-          <w:rPr>
-            <w:rStyle w:val="Hyperlink"/>
-          </w:rPr>
-          <w:t xml:space="preserve"> </w:t>
-        </w:r>
-        <w:r>
-          <w:rPr>
-            <w:rStyle w:val="Hyperlink"/>
-          </w:rPr>
-          <w:t xml:space="preserve">Optimization</w:t>
-        </w:r>
-        <w:r>
-          <w:rPr>
-            <w:rStyle w:val="Hyperlink"/>
-          </w:rPr>
-          <w:t xml:space="preserve"> </w:t>
-        </w:r>
-        <w:r>
-          <w:rPr>
-            <w:rStyle w:val="Hyperlink"/>
-          </w:rPr>
-          <w:t xml:space="preserve">of</w:t>
-        </w:r>
-        <w:r>
-          <w:rPr>
-            <w:rStyle w:val="Hyperlink"/>
-          </w:rPr>
-          <w:t xml:space="preserve"> </w:t>
-        </w:r>
-        <w:r>
-          <w:rPr>
-            <w:rStyle w:val="Hyperlink"/>
-          </w:rPr>
-          <w:t xml:space="preserve">Electric</w:t>
-        </w:r>
-        <w:r>
-          <w:rPr>
-            <w:rStyle w:val="Hyperlink"/>
-          </w:rPr>
-          <w:t xml:space="preserve"> </w:t>
-        </w:r>
-        <w:r>
-          <w:rPr>
-            <w:rStyle w:val="Hyperlink"/>
-          </w:rPr>
-          <w:t xml:space="preserve">Power</w:t>
-        </w:r>
-        <w:r>
-          <w:rPr>
-            <w:rStyle w:val="Hyperlink"/>
-          </w:rPr>
-          <w:t xml:space="preserve"> </w:t>
-        </w:r>
-        <w:r>
-          <w:rPr>
-            <w:rStyle w:val="Hyperlink"/>
-          </w:rPr>
-          <w:t xml:space="preserve">Systems</w:t>
-        </w:r>
-      </w:hyperlink>
-      <w:r>
-        <w:rPr>
-          <w:rFonts w:ascii="Times New Roman" w:hAnsi="Times New Roman" w:eastAsia="Times New Roman" w:cs="Times New Roman"/>
-          <w:sz w:val="16"/>
-        </w:rPr>
-        <w:t xml:space="preserve">.</w:t>
-      </w:r>
-      <w:r>
-        <w:rPr>
-          <w:rFonts w:ascii="Times New Roman" w:hAnsi="Times New Roman" w:eastAsia="Times New Roman" w:cs="Times New Roman"/>
-          <w:sz w:val="16"/>
-        </w:rPr>
-        <w:t xml:space="preserve"> </w:t>
-      </w:r>
-      <w:r>
-        <w:rPr>
-          <w:rFonts w:ascii="Times New Roman" w:hAnsi="Times New Roman" w:eastAsia="Times New Roman" w:cs="Times New Roman"/>
-          <w:i/>
-          <w:iCs/>
-          <w:sz w:val="16"/>
-        </w:rPr>
-        <w:t xml:space="preserve">IEEE</w:t>
-      </w:r>
-      <w:r>
-        <w:rPr>
-          <w:rFonts w:ascii="Times New Roman" w:hAnsi="Times New Roman" w:eastAsia="Times New Roman" w:cs="Times New Roman"/>
-          <w:i/>
-          <w:iCs/>
-          <w:sz w:val="16"/>
-        </w:rPr>
-        <w:t xml:space="preserve"> </w:t>
-      </w:r>
-      <w:r>
-        <w:rPr>
-          <w:rFonts w:ascii="Times New Roman" w:hAnsi="Times New Roman" w:eastAsia="Times New Roman" w:cs="Times New Roman"/>
-          <w:i/>
-          <w:iCs/>
-          <w:sz w:val="16"/>
-        </w:rPr>
-        <w:t xml:space="preserve">Transactions on Power Systems</w:t>
-      </w:r>
-      <w:r>
-        <w:rPr>
-          <w:rFonts w:ascii="Times New Roman" w:hAnsi="Times New Roman" w:eastAsia="Times New Roman" w:cs="Times New Roman"/>
-          <w:sz w:val="16"/>
-        </w:rPr>
-        <w:t xml:space="preserve"> </w:t>
-      </w:r>
-      <w:r>
-        <w:rPr>
-          <w:rFonts w:ascii="Times New Roman" w:hAnsi="Times New Roman" w:eastAsia="Times New Roman" w:cs="Times New Roman"/>
-          <w:b/>
-          <w:bCs/>
-          <w:sz w:val="16"/>
-        </w:rPr>
-        <w:t xml:space="preserve">33</w:t>
-      </w:r>
-      <w:r>
-        <w:rPr>
-          <w:rFonts w:ascii="Times New Roman" w:hAnsi="Times New Roman" w:eastAsia="Times New Roman" w:cs="Times New Roman"/>
-          <w:sz w:val="16"/>
-        </w:rPr>
-        <w:t xml:space="preserve">, 6510–6521 (2018).</w:t>
-      </w:r>
-    </w:p>
-    <w:p>
-      <w:pPr>
-        <w:pStyle w:val="Bibliography"/>
-        <w:widowControl/>
-      </w:pPr>
-      <w:r>
-        <w:rPr>
-          <w:rFonts w:ascii="Times New Roman" w:hAnsi="Times New Roman" w:eastAsia="Times New Roman" w:cs="Times New Roman"/>
-          <w:sz w:val="16"/>
-        </w:rPr>
-        <w:t xml:space="preserve">2.</w:t>
-      </w:r>
-    </w:p>
-    <w:p>
-      <w:pPr>
-        <w:pStyle w:val="Bibliography"/>
-        <w:widowControl/>
-      </w:pPr>
-      <w:r>
-        <w:rPr>
-          <w:rFonts w:ascii="Times New Roman" w:hAnsi="Times New Roman" w:eastAsia="Times New Roman" w:cs="Times New Roman"/>
-          <w:sz w:val="16"/>
-        </w:rPr>
-        <w:t xml:space="preserve">Hörsch, J., Hofmann, F., Schlachtberger, D. &amp; Brown, T.</w:t>
-      </w:r>
-      <w:r>
-        <w:rPr>
-          <w:rFonts w:ascii="Times New Roman" w:hAnsi="Times New Roman" w:eastAsia="Times New Roman" w:cs="Times New Roman"/>
-          <w:sz w:val="16"/>
-        </w:rPr>
-        <w:t xml:space="preserve"> </w:t>
-      </w:r>
-      <w:hyperlink r:id="rId83">
         <w:r>
           <w:rPr>
             <w:rStyle w:val="Hyperlink"/>
@@ -30722,7 +30417,7 @@
           <w:rFonts w:ascii="Times New Roman" w:hAnsi="Times New Roman" w:eastAsia="Times New Roman" w:cs="Times New Roman"/>
           <w:sz w:val="16"/>
         </w:rPr>
-        <w:t xml:space="preserve">3.</w:t>
+        <w:t xml:space="preserve">2.</w:t>
       </w:r>
     </w:p>
     <w:p>
@@ -30760,7 +30455,7 @@
         </w:rPr>
         <w:t xml:space="preserve"> </w:t>
       </w:r>
-      <w:hyperlink r:id="rId84">
+      <w:hyperlink r:id="rId83">
         <w:r>
           <w:rPr>
             <w:rStyle w:val="Hyperlink"/>
@@ -31005,7 +30700,7 @@
           <w:rFonts w:ascii="Times New Roman" w:hAnsi="Times New Roman" w:eastAsia="Times New Roman" w:cs="Times New Roman"/>
           <w:sz w:val="16"/>
         </w:rPr>
-        <w:t xml:space="preserve">4.</w:t>
+        <w:t xml:space="preserve">3.</w:t>
       </w:r>
     </w:p>
     <w:p>
@@ -31041,7 +30736,7 @@
         </w:rPr>
         <w:t xml:space="preserve"> </w:t>
       </w:r>
-      <w:hyperlink r:id="rId85">
+      <w:hyperlink r:id="rId84">
         <w:r>
           <w:rPr>
             <w:rStyle w:val="Hyperlink"/>
@@ -31226,7 +30921,7 @@
           <w:rFonts w:ascii="Times New Roman" w:hAnsi="Times New Roman" w:eastAsia="Times New Roman" w:cs="Times New Roman"/>
           <w:sz w:val="16"/>
         </w:rPr>
-        <w:t xml:space="preserve">5.</w:t>
+        <w:t xml:space="preserve">4.</w:t>
       </w:r>
     </w:p>
     <w:p>
@@ -31379,7 +31074,7 @@
         </w:rPr>
         <w:t xml:space="preserve"> </w:t>
       </w:r>
-      <w:hyperlink r:id="rId86">
+      <w:hyperlink r:id="rId85">
         <w:r>
           <w:rPr>
             <w:rStyle w:val="Hyperlink"/>
@@ -31412,7 +31107,7 @@
           <w:rFonts w:ascii="Times New Roman" w:hAnsi="Times New Roman" w:eastAsia="Times New Roman" w:cs="Times New Roman"/>
           <w:sz w:val="16"/>
         </w:rPr>
-        <w:t xml:space="preserve">6.</w:t>
+        <w:t xml:space="preserve">5.</w:t>
       </w:r>
     </w:p>
     <w:p>
@@ -31434,7 +31129,7 @@
         </w:rPr>
         <w:t xml:space="preserve"> </w:t>
       </w:r>
-      <w:hyperlink r:id="rId87">
+      <w:hyperlink r:id="rId86">
         <w:r>
           <w:rPr>
             <w:rStyle w:val="Hyperlink"/>
@@ -31592,7 +31287,7 @@
           <w:rFonts w:ascii="Times New Roman" w:hAnsi="Times New Roman" w:eastAsia="Times New Roman" w:cs="Times New Roman"/>
           <w:sz w:val="16"/>
         </w:rPr>
-        <w:t xml:space="preserve">7.</w:t>
+        <w:t xml:space="preserve">6.</w:t>
       </w:r>
     </w:p>
     <w:p>
@@ -31614,7 +31309,7 @@
         </w:rPr>
         <w:t xml:space="preserve"> </w:t>
       </w:r>
-      <w:hyperlink r:id="rId88">
+      <w:hyperlink r:id="rId87">
         <w:r>
           <w:rPr>
             <w:rStyle w:val="Hyperlink"/>
@@ -31676,7 +31371,7 @@
           <w:rFonts w:ascii="Times New Roman" w:hAnsi="Times New Roman" w:eastAsia="Times New Roman" w:cs="Times New Roman"/>
           <w:sz w:val="16"/>
         </w:rPr>
-        <w:t xml:space="preserve">8.</w:t>
+        <w:t xml:space="preserve">7.</w:t>
       </w:r>
     </w:p>
     <w:p>
@@ -31698,7 +31393,7 @@
         </w:rPr>
         <w:t xml:space="preserve"> </w:t>
       </w:r>
-      <w:hyperlink r:id="rId89">
+      <w:hyperlink r:id="rId88">
         <w:r>
           <w:rPr>
             <w:rStyle w:val="Hyperlink"/>
@@ -31772,7 +31467,7 @@
           <w:rFonts w:ascii="Times New Roman" w:hAnsi="Times New Roman" w:eastAsia="Times New Roman" w:cs="Times New Roman"/>
           <w:sz w:val="16"/>
         </w:rPr>
-        <w:t xml:space="preserve">9.</w:t>
+        <w:t xml:space="preserve">8.</w:t>
       </w:r>
     </w:p>
     <w:p>
@@ -31925,7 +31620,7 @@
         </w:rPr>
         <w:t xml:space="preserve"> </w:t>
       </w:r>
-      <w:hyperlink r:id="rId90">
+      <w:hyperlink r:id="rId89">
         <w:r>
           <w:rPr>
             <w:rStyle w:val="Hyperlink"/>
@@ -31958,7 +31653,7 @@
           <w:rFonts w:ascii="Times New Roman" w:hAnsi="Times New Roman" w:eastAsia="Times New Roman" w:cs="Times New Roman"/>
           <w:sz w:val="16"/>
         </w:rPr>
-        <w:t xml:space="preserve">10.</w:t>
+        <w:t xml:space="preserve">9.</w:t>
       </w:r>
     </w:p>
     <w:p>
@@ -31980,7 +31675,7 @@
         </w:rPr>
         <w:t xml:space="preserve"> </w:t>
       </w:r>
-      <w:hyperlink r:id="rId91">
+      <w:hyperlink r:id="rId90">
         <w:r>
           <w:rPr>
             <w:rStyle w:val="Hyperlink"/>
@@ -32006,7 +31701,7 @@
           <w:rFonts w:ascii="Times New Roman" w:hAnsi="Times New Roman" w:eastAsia="Times New Roman" w:cs="Times New Roman"/>
           <w:sz w:val="16"/>
         </w:rPr>
-        <w:t xml:space="preserve">11.</w:t>
+        <w:t xml:space="preserve">10.</w:t>
       </w:r>
     </w:p>
     <w:p>
@@ -32028,7 +31723,7 @@
         </w:rPr>
         <w:t xml:space="preserve"> </w:t>
       </w:r>
-      <w:hyperlink r:id="rId92">
+      <w:hyperlink r:id="rId91">
         <w:r>
           <w:rPr>
             <w:rStyle w:val="Hyperlink"/>
@@ -32102,7 +31797,7 @@
           <w:rFonts w:ascii="Times New Roman" w:hAnsi="Times New Roman" w:eastAsia="Times New Roman" w:cs="Times New Roman"/>
           <w:sz w:val="16"/>
         </w:rPr>
-        <w:t xml:space="preserve">12.</w:t>
+        <w:t xml:space="preserve">11.</w:t>
       </w:r>
     </w:p>
     <w:p>
@@ -32124,7 +31819,7 @@
         </w:rPr>
         <w:t xml:space="preserve"> </w:t>
       </w:r>
-      <w:hyperlink r:id="rId93">
+      <w:hyperlink r:id="rId92">
         <w:r>
           <w:rPr>
             <w:rStyle w:val="Hyperlink"/>
@@ -32174,7 +31869,7 @@
           <w:rFonts w:ascii="Times New Roman" w:hAnsi="Times New Roman" w:eastAsia="Times New Roman" w:cs="Times New Roman"/>
           <w:sz w:val="16"/>
         </w:rPr>
-        <w:t xml:space="preserve">13.</w:t>
+        <w:t xml:space="preserve">12.</w:t>
       </w:r>
     </w:p>
     <w:p>
@@ -32196,7 +31891,7 @@
         </w:rPr>
         <w:t xml:space="preserve"> </w:t>
       </w:r>
-      <w:hyperlink r:id="rId94">
+      <w:hyperlink r:id="rId93">
         <w:r>
           <w:rPr>
             <w:rStyle w:val="Hyperlink"/>
@@ -32234,7 +31929,7 @@
           <w:rFonts w:ascii="Times New Roman" w:hAnsi="Times New Roman" w:eastAsia="Times New Roman" w:cs="Times New Roman"/>
           <w:sz w:val="16"/>
         </w:rPr>
-        <w:t xml:space="preserve">14.</w:t>
+        <w:t xml:space="preserve">13.</w:t>
       </w:r>
     </w:p>
     <w:p>
@@ -32256,7 +31951,7 @@
         </w:rPr>
         <w:t xml:space="preserve"> </w:t>
       </w:r>
-      <w:hyperlink r:id="rId95">
+      <w:hyperlink r:id="rId94">
         <w:r>
           <w:rPr>
             <w:rStyle w:val="Hyperlink"/>
@@ -32294,6 +31989,120 @@
           <w:sz w:val="16"/>
         </w:rPr>
         <w:t xml:space="preserve">.</w:t>
+      </w:r>
+    </w:p>
+    <w:p>
+      <w:pPr>
+        <w:pStyle w:val="Bibliography"/>
+        <w:widowControl/>
+      </w:pPr>
+      <w:r>
+        <w:rPr>
+          <w:rFonts w:ascii="Times New Roman" w:hAnsi="Times New Roman" w:eastAsia="Times New Roman" w:cs="Times New Roman"/>
+          <w:sz w:val="16"/>
+        </w:rPr>
+        <w:t xml:space="preserve">14.</w:t>
+      </w:r>
+    </w:p>
+    <w:p>
+      <w:pPr>
+        <w:pStyle w:val="Bibliography"/>
+        <w:widowControl/>
+      </w:pPr>
+      <w:r>
+        <w:rPr>
+          <w:rFonts w:ascii="Times New Roman" w:hAnsi="Times New Roman" w:eastAsia="Times New Roman" w:cs="Times New Roman"/>
+          <w:sz w:val="16"/>
+        </w:rPr>
+        <w:t xml:space="preserve">E-REDES &amp; Entidade Reguladora dos Serviços Energéticos.</w:t>
+      </w:r>
+      <w:r>
+        <w:rPr>
+          <w:rFonts w:ascii="Times New Roman" w:hAnsi="Times New Roman" w:eastAsia="Times New Roman" w:cs="Times New Roman"/>
+          <w:sz w:val="16"/>
+        </w:rPr>
+        <w:t xml:space="preserve"> </w:t>
+      </w:r>
+      <w:r>
+        <w:rPr>
+          <w:rFonts w:ascii="Times New Roman" w:hAnsi="Times New Roman" w:eastAsia="Times New Roman" w:cs="Times New Roman"/>
+          <w:i/>
+          <w:iCs/>
+          <w:sz w:val="16"/>
+        </w:rPr>
+        <w:t xml:space="preserve">PDIRD-e 2020,</w:t>
+      </w:r>
+      <w:r>
+        <w:rPr>
+          <w:rFonts w:ascii="Times New Roman" w:hAnsi="Times New Roman" w:eastAsia="Times New Roman" w:cs="Times New Roman"/>
+          <w:i/>
+          <w:iCs/>
+          <w:sz w:val="16"/>
+        </w:rPr>
+        <w:t xml:space="preserve"> </w:t>
+      </w:r>
+      <w:r>
+        <w:rPr>
+          <w:rFonts w:ascii="Times New Roman" w:hAnsi="Times New Roman" w:eastAsia="Times New Roman" w:cs="Times New Roman"/>
+          <w:i/>
+          <w:iCs/>
+          <w:sz w:val="16"/>
+        </w:rPr>
+        <w:t xml:space="preserve">Anexo</w:t>
+      </w:r>
+      <w:r>
+        <w:rPr>
+          <w:rFonts w:ascii="Times New Roman" w:hAnsi="Times New Roman" w:eastAsia="Times New Roman" w:cs="Times New Roman"/>
+          <w:i/>
+          <w:iCs/>
+          <w:sz w:val="16"/>
+        </w:rPr>
+        <w:t xml:space="preserve"> </w:t>
+      </w:r>
+      <w:r>
+        <w:rPr>
+          <w:rFonts w:ascii="Times New Roman" w:hAnsi="Times New Roman" w:eastAsia="Times New Roman" w:cs="Times New Roman"/>
+          <w:i/>
+          <w:iCs/>
+          <w:sz w:val="16"/>
+        </w:rPr>
+        <w:t xml:space="preserve">B</w:t>
+      </w:r>
+      <w:r>
+        <w:rPr>
+          <w:rFonts w:ascii="Times New Roman" w:hAnsi="Times New Roman" w:eastAsia="Times New Roman" w:cs="Times New Roman"/>
+          <w:sz w:val="16"/>
+        </w:rPr>
+        <w:t xml:space="preserve">.</w:t>
+      </w:r>
+      <w:r>
+        <w:rPr>
+          <w:rFonts w:ascii="Times New Roman" w:hAnsi="Times New Roman" w:eastAsia="Times New Roman" w:cs="Times New Roman"/>
+          <w:sz w:val="16"/>
+        </w:rPr>
+        <w:t xml:space="preserve"> </w:t>
+      </w:r>
+      <w:hyperlink r:id="rId95">
+        <w:r>
+          <w:rPr>
+            <w:rStyle w:val="Hyperlink"/>
+          </w:rPr>
+          <w:t xml:space="preserve">https://www.erse.pt/media/340hrot0/proposta-pdird-e-2020_anexo_b.pdf</w:t>
+        </w:r>
+      </w:hyperlink>
+      <w:r>
+        <w:rPr>
+          <w:rFonts w:ascii="Times New Roman" w:hAnsi="Times New Roman" w:eastAsia="Times New Roman" w:cs="Times New Roman"/>
+          <w:sz w:val="16"/>
+        </w:rPr>
+        <w:t xml:space="preserve"> </w:t>
+      </w:r>
+      <w:r>
+        <w:rPr>
+          <w:rFonts w:ascii="Times New Roman" w:hAnsi="Times New Roman" w:eastAsia="Times New Roman" w:cs="Times New Roman"/>
+          <w:sz w:val="16"/>
+        </w:rPr>
+        <w:t xml:space="preserve">(2020).</w:t>
       </w:r>
     </w:p>
     <w:p>
@@ -32633,7 +32442,7 @@
           <w:rFonts w:ascii="Times New Roman" w:hAnsi="Times New Roman" w:eastAsia="Times New Roman" w:cs="Times New Roman"/>
           <w:sz w:val="16"/>
         </w:rPr>
-        <w:t xml:space="preserve">E-REDES &amp; Entidade Reguladora dos Serviços Energéticos.</w:t>
+        <w:t xml:space="preserve">EDP Distribuição.</w:t>
       </w:r>
       <w:r>
         <w:rPr>
@@ -32642,121 +32451,7 @@
         </w:rPr>
         <w:t xml:space="preserve"> </w:t>
       </w:r>
-      <w:r>
-        <w:rPr>
-          <w:rFonts w:ascii="Times New Roman" w:hAnsi="Times New Roman" w:eastAsia="Times New Roman" w:cs="Times New Roman"/>
-          <w:i/>
-          <w:iCs/>
-          <w:sz w:val="16"/>
-        </w:rPr>
-        <w:t xml:space="preserve">PDIRD-e 2020,</w:t>
-      </w:r>
-      <w:r>
-        <w:rPr>
-          <w:rFonts w:ascii="Times New Roman" w:hAnsi="Times New Roman" w:eastAsia="Times New Roman" w:cs="Times New Roman"/>
-          <w:i/>
-          <w:iCs/>
-          <w:sz w:val="16"/>
-        </w:rPr>
-        <w:t xml:space="preserve"> </w:t>
-      </w:r>
-      <w:r>
-        <w:rPr>
-          <w:rFonts w:ascii="Times New Roman" w:hAnsi="Times New Roman" w:eastAsia="Times New Roman" w:cs="Times New Roman"/>
-          <w:i/>
-          <w:iCs/>
-          <w:sz w:val="16"/>
-        </w:rPr>
-        <w:t xml:space="preserve">Anexo</w:t>
-      </w:r>
-      <w:r>
-        <w:rPr>
-          <w:rFonts w:ascii="Times New Roman" w:hAnsi="Times New Roman" w:eastAsia="Times New Roman" w:cs="Times New Roman"/>
-          <w:i/>
-          <w:iCs/>
-          <w:sz w:val="16"/>
-        </w:rPr>
-        <w:t xml:space="preserve"> </w:t>
-      </w:r>
-      <w:r>
-        <w:rPr>
-          <w:rFonts w:ascii="Times New Roman" w:hAnsi="Times New Roman" w:eastAsia="Times New Roman" w:cs="Times New Roman"/>
-          <w:i/>
-          <w:iCs/>
-          <w:sz w:val="16"/>
-        </w:rPr>
-        <w:t xml:space="preserve">B</w:t>
-      </w:r>
-      <w:r>
-        <w:rPr>
-          <w:rFonts w:ascii="Times New Roman" w:hAnsi="Times New Roman" w:eastAsia="Times New Roman" w:cs="Times New Roman"/>
-          <w:sz w:val="16"/>
-        </w:rPr>
-        <w:t xml:space="preserve">.</w:t>
-      </w:r>
-      <w:r>
-        <w:rPr>
-          <w:rFonts w:ascii="Times New Roman" w:hAnsi="Times New Roman" w:eastAsia="Times New Roman" w:cs="Times New Roman"/>
-          <w:sz w:val="16"/>
-        </w:rPr>
-        <w:t xml:space="preserve"> </w:t>
-      </w:r>
       <w:hyperlink r:id="rId100">
-        <w:r>
-          <w:rPr>
-            <w:rStyle w:val="Hyperlink"/>
-          </w:rPr>
-          <w:t xml:space="preserve">https://www.erse.pt/media/340hrot0/proposta-pdird-e-2020_anexo_b.pdf</w:t>
-        </w:r>
-      </w:hyperlink>
-      <w:r>
-        <w:rPr>
-          <w:rFonts w:ascii="Times New Roman" w:hAnsi="Times New Roman" w:eastAsia="Times New Roman" w:cs="Times New Roman"/>
-          <w:sz w:val="16"/>
-        </w:rPr>
-        <w:t xml:space="preserve"> </w:t>
-      </w:r>
-      <w:r>
-        <w:rPr>
-          <w:rFonts w:ascii="Times New Roman" w:hAnsi="Times New Roman" w:eastAsia="Times New Roman" w:cs="Times New Roman"/>
-          <w:sz w:val="16"/>
-        </w:rPr>
-        <w:t xml:space="preserve">(2020).</w:t>
-      </w:r>
-    </w:p>
-    <w:p>
-      <w:pPr>
-        <w:pStyle w:val="Bibliography"/>
-        <w:widowControl/>
-      </w:pPr>
-      <w:r>
-        <w:rPr>
-          <w:rFonts w:ascii="Times New Roman" w:hAnsi="Times New Roman" w:eastAsia="Times New Roman" w:cs="Times New Roman"/>
-          <w:sz w:val="16"/>
-        </w:rPr>
-        <w:t xml:space="preserve">20.</w:t>
-      </w:r>
-    </w:p>
-    <w:p>
-      <w:pPr>
-        <w:pStyle w:val="Bibliography"/>
-        <w:widowControl/>
-      </w:pPr>
-      <w:r>
-        <w:rPr>
-          <w:rFonts w:ascii="Times New Roman" w:hAnsi="Times New Roman" w:eastAsia="Times New Roman" w:cs="Times New Roman"/>
-          <w:sz w:val="16"/>
-        </w:rPr>
-        <w:t xml:space="preserve">EDP Distribuição.</w:t>
-      </w:r>
-      <w:r>
-        <w:rPr>
-          <w:rFonts w:ascii="Times New Roman" w:hAnsi="Times New Roman" w:eastAsia="Times New Roman" w:cs="Times New Roman"/>
-          <w:sz w:val="16"/>
-        </w:rPr>
-        <w:t xml:space="preserve"> </w:t>
-      </w:r>
-      <w:hyperlink r:id="rId101">
         <w:r>
           <w:rPr>
             <w:rStyle w:val="Hyperlink"/>
@@ -32782,6 +32477,283 @@
           <w:sz w:val="16"/>
         </w:rPr>
         <w:t xml:space="preserve">. (2019).</w:t>
+      </w:r>
+    </w:p>
+    <w:p>
+      <w:pPr>
+        <w:pStyle w:val="Bibliography"/>
+        <w:widowControl/>
+      </w:pPr>
+      <w:r>
+        <w:rPr>
+          <w:rFonts w:ascii="Times New Roman" w:hAnsi="Times New Roman" w:eastAsia="Times New Roman" w:cs="Times New Roman"/>
+          <w:sz w:val="16"/>
+        </w:rPr>
+        <w:t xml:space="preserve">20.</w:t>
+      </w:r>
+    </w:p>
+    <w:p>
+      <w:pPr>
+        <w:pStyle w:val="Bibliography"/>
+        <w:widowControl/>
+      </w:pPr>
+      <w:r>
+        <w:rPr>
+          <w:rFonts w:ascii="Times New Roman" w:hAnsi="Times New Roman" w:eastAsia="Times New Roman" w:cs="Times New Roman"/>
+          <w:sz w:val="16"/>
+        </w:rPr>
+        <w:t xml:space="preserve">Thurner, L.</w:t>
+      </w:r>
+      <w:r>
+        <w:rPr>
+          <w:rFonts w:ascii="Times New Roman" w:hAnsi="Times New Roman" w:eastAsia="Times New Roman" w:cs="Times New Roman"/>
+          <w:sz w:val="16"/>
+        </w:rPr>
+        <w:t xml:space="preserve"> </w:t>
+      </w:r>
+      <w:r>
+        <w:rPr>
+          <w:rFonts w:ascii="Times New Roman" w:hAnsi="Times New Roman" w:eastAsia="Times New Roman" w:cs="Times New Roman"/>
+          <w:i/>
+          <w:iCs/>
+          <w:sz w:val="16"/>
+        </w:rPr>
+        <w:t xml:space="preserve">et al.</w:t>
+      </w:r>
+      <w:r>
+        <w:rPr>
+          <w:rFonts w:ascii="Times New Roman" w:hAnsi="Times New Roman" w:eastAsia="Times New Roman" w:cs="Times New Roman"/>
+          <w:sz w:val="16"/>
+        </w:rPr>
+        <w:t xml:space="preserve"> </w:t>
+      </w:r>
+      <w:hyperlink r:id="rId101">
+        <w:r>
+          <w:rPr>
+            <w:rStyle w:val="Hyperlink"/>
+          </w:rPr>
+          <w:t xml:space="preserve">Pandapower—an</w:t>
+        </w:r>
+        <w:r>
+          <w:rPr>
+            <w:rStyle w:val="Hyperlink"/>
+          </w:rPr>
+          <w:t xml:space="preserve"> </w:t>
+        </w:r>
+        <w:r>
+          <w:rPr>
+            <w:rStyle w:val="Hyperlink"/>
+          </w:rPr>
+          <w:t xml:space="preserve">Open-Source</w:t>
+        </w:r>
+        <w:r>
+          <w:rPr>
+            <w:rStyle w:val="Hyperlink"/>
+          </w:rPr>
+          <w:t xml:space="preserve"> </w:t>
+        </w:r>
+        <w:r>
+          <w:rPr>
+            <w:rStyle w:val="Hyperlink"/>
+          </w:rPr>
+          <w:t xml:space="preserve">Python</w:t>
+        </w:r>
+        <w:r>
+          <w:rPr>
+            <w:rStyle w:val="Hyperlink"/>
+          </w:rPr>
+          <w:t xml:space="preserve"> </w:t>
+        </w:r>
+        <w:r>
+          <w:rPr>
+            <w:rStyle w:val="Hyperlink"/>
+          </w:rPr>
+          <w:t xml:space="preserve">Tool</w:t>
+        </w:r>
+        <w:r>
+          <w:rPr>
+            <w:rStyle w:val="Hyperlink"/>
+          </w:rPr>
+          <w:t xml:space="preserve"> </w:t>
+        </w:r>
+        <w:r>
+          <w:rPr>
+            <w:rStyle w:val="Hyperlink"/>
+          </w:rPr>
+          <w:t xml:space="preserve">for</w:t>
+        </w:r>
+        <w:r>
+          <w:rPr>
+            <w:rStyle w:val="Hyperlink"/>
+          </w:rPr>
+          <w:t xml:space="preserve"> </w:t>
+        </w:r>
+        <w:r>
+          <w:rPr>
+            <w:rStyle w:val="Hyperlink"/>
+          </w:rPr>
+          <w:t xml:space="preserve">Convenient</w:t>
+        </w:r>
+        <w:r>
+          <w:rPr>
+            <w:rStyle w:val="Hyperlink"/>
+          </w:rPr>
+          <w:t xml:space="preserve"> </w:t>
+        </w:r>
+        <w:r>
+          <w:rPr>
+            <w:rStyle w:val="Hyperlink"/>
+          </w:rPr>
+          <w:t xml:space="preserve">Modeling,</w:t>
+        </w:r>
+        <w:r>
+          <w:rPr>
+            <w:rStyle w:val="Hyperlink"/>
+          </w:rPr>
+          <w:t xml:space="preserve"> </w:t>
+        </w:r>
+        <w:r>
+          <w:rPr>
+            <w:rStyle w:val="Hyperlink"/>
+          </w:rPr>
+          <w:t xml:space="preserve">Analysis,</w:t>
+        </w:r>
+        <w:r>
+          <w:rPr>
+            <w:rStyle w:val="Hyperlink"/>
+          </w:rPr>
+          <w:t xml:space="preserve"> </w:t>
+        </w:r>
+        <w:r>
+          <w:rPr>
+            <w:rStyle w:val="Hyperlink"/>
+          </w:rPr>
+          <w:t xml:space="preserve">and</w:t>
+        </w:r>
+        <w:r>
+          <w:rPr>
+            <w:rStyle w:val="Hyperlink"/>
+          </w:rPr>
+          <w:t xml:space="preserve"> </w:t>
+        </w:r>
+        <w:r>
+          <w:rPr>
+            <w:rStyle w:val="Hyperlink"/>
+          </w:rPr>
+          <w:t xml:space="preserve">Optimization</w:t>
+        </w:r>
+        <w:r>
+          <w:rPr>
+            <w:rStyle w:val="Hyperlink"/>
+          </w:rPr>
+          <w:t xml:space="preserve"> </w:t>
+        </w:r>
+        <w:r>
+          <w:rPr>
+            <w:rStyle w:val="Hyperlink"/>
+          </w:rPr>
+          <w:t xml:space="preserve">of</w:t>
+        </w:r>
+        <w:r>
+          <w:rPr>
+            <w:rStyle w:val="Hyperlink"/>
+          </w:rPr>
+          <w:t xml:space="preserve"> </w:t>
+        </w:r>
+        <w:r>
+          <w:rPr>
+            <w:rStyle w:val="Hyperlink"/>
+          </w:rPr>
+          <w:t xml:space="preserve">Electric</w:t>
+        </w:r>
+        <w:r>
+          <w:rPr>
+            <w:rStyle w:val="Hyperlink"/>
+          </w:rPr>
+          <w:t xml:space="preserve"> </w:t>
+        </w:r>
+        <w:r>
+          <w:rPr>
+            <w:rStyle w:val="Hyperlink"/>
+          </w:rPr>
+          <w:t xml:space="preserve">Power</w:t>
+        </w:r>
+        <w:r>
+          <w:rPr>
+            <w:rStyle w:val="Hyperlink"/>
+          </w:rPr>
+          <w:t xml:space="preserve"> </w:t>
+        </w:r>
+        <w:r>
+          <w:rPr>
+            <w:rStyle w:val="Hyperlink"/>
+          </w:rPr>
+          <w:t xml:space="preserve">Systems</w:t>
+        </w:r>
+      </w:hyperlink>
+      <w:r>
+        <w:rPr>
+          <w:rFonts w:ascii="Times New Roman" w:hAnsi="Times New Roman" w:eastAsia="Times New Roman" w:cs="Times New Roman"/>
+          <w:sz w:val="16"/>
+        </w:rPr>
+        <w:t xml:space="preserve">.</w:t>
+      </w:r>
+      <w:r>
+        <w:rPr>
+          <w:rFonts w:ascii="Times New Roman" w:hAnsi="Times New Roman" w:eastAsia="Times New Roman" w:cs="Times New Roman"/>
+          <w:sz w:val="16"/>
+        </w:rPr>
+        <w:t xml:space="preserve"> </w:t>
+      </w:r>
+      <w:r>
+        <w:rPr>
+          <w:rFonts w:ascii="Times New Roman" w:hAnsi="Times New Roman" w:eastAsia="Times New Roman" w:cs="Times New Roman"/>
+          <w:i/>
+          <w:iCs/>
+          <w:sz w:val="16"/>
+        </w:rPr>
+        <w:t xml:space="preserve">IEEE</w:t>
+      </w:r>
+      <w:r>
+        <w:rPr>
+          <w:rFonts w:ascii="Times New Roman" w:hAnsi="Times New Roman" w:eastAsia="Times New Roman" w:cs="Times New Roman"/>
+          <w:i/>
+          <w:iCs/>
+          <w:sz w:val="16"/>
+        </w:rPr>
+        <w:t xml:space="preserve"> </w:t>
+      </w:r>
+      <w:r>
+        <w:rPr>
+          <w:rFonts w:ascii="Times New Roman" w:hAnsi="Times New Roman" w:eastAsia="Times New Roman" w:cs="Times New Roman"/>
+          <w:i/>
+          <w:iCs/>
+          <w:sz w:val="16"/>
+        </w:rPr>
+        <w:t xml:space="preserve">Transactions on Power Systems</w:t>
+      </w:r>
+      <w:r>
+        <w:rPr>
+          <w:rFonts w:ascii="Times New Roman" w:hAnsi="Times New Roman" w:eastAsia="Times New Roman" w:cs="Times New Roman"/>
+          <w:sz w:val="16"/>
+        </w:rPr>
+        <w:t xml:space="preserve"> </w:t>
+      </w:r>
+      <w:r>
+        <w:rPr>
+          <w:rFonts w:ascii="Times New Roman" w:hAnsi="Times New Roman" w:eastAsia="Times New Roman" w:cs="Times New Roman"/>
+          <w:b/>
+          <w:bCs/>
+          <w:sz w:val="16"/>
+        </w:rPr>
+        <w:t xml:space="preserve">33</w:t>
+      </w:r>
+      <w:r>
+        <w:rPr>
+          <w:rFonts w:ascii="Times New Roman" w:hAnsi="Times New Roman" w:eastAsia="Times New Roman" w:cs="Times New Roman"/>
+          <w:sz w:val="16"/>
+        </w:rPr>
+        <w:t xml:space="preserve">, 6510–6521 (2018).</w:t>
       </w:r>
     </w:p>
     <w:p>

</xml_diff>

<commit_message>
Use preferred abstract wording in submission manuscript
</commit_message>
<xml_diff>
--- a/paper/SimPT60_submission_en.docx
+++ b/paper/SimPT60_submission_en.docx
@@ -51,7 +51,7 @@
           <w:rFonts w:ascii="Times New Roman" w:hAnsi="Times New Roman" w:eastAsia="Times New Roman" w:cs="Times New Roman"/>
           <w:sz w:val="20"/>
         </w:rPr>
-        <w:t xml:space="preserve">Publicly accessible power-system data are commonly fragmented across</w:t>
+        <w:t xml:space="preserve">Publicly accessible power-grid data are often fragmented across network</w:t>
       </w:r>
       <w:r>
         <w:rPr>
@@ -65,7 +65,7 @@
           <w:rFonts w:ascii="Times New Roman" w:hAnsi="Times New Roman" w:eastAsia="Times New Roman" w:cs="Times New Roman"/>
           <w:sz w:val="20"/>
         </w:rPr>
-        <w:t xml:space="preserve">network structure, equipment attributes, and operating records, which</w:t>
+        <w:t xml:space="preserve">structure, equipment attributes, and operating records, limiting their</w:t>
       </w:r>
       <w:r>
         <w:rPr>
@@ -79,7 +79,7 @@
           <w:rFonts w:ascii="Times New Roman" w:hAnsi="Times New Roman" w:eastAsia="Times New Roman" w:cs="Times New Roman"/>
           <w:sz w:val="20"/>
         </w:rPr>
-        <w:t xml:space="preserve">limits their direct use in continuous power-flow analysis and method</w:t>
+        <w:t xml:space="preserve">direct use for continuous power-flow analysis and method comparison. We</w:t>
       </w:r>
       <w:r>
         <w:rPr>
@@ -93,7 +93,7 @@
           <w:rFonts w:ascii="Times New Roman" w:hAnsi="Times New Roman" w:eastAsia="Times New Roman" w:cs="Times New Roman"/>
           <w:sz w:val="20"/>
         </w:rPr>
-        <w:t xml:space="preserve">comparison. We present SimPT60, a research dataset reconstructed from</w:t>
+        <w:t xml:space="preserve">present SimPT60, a research dataset constructed from multiple public</w:t>
       </w:r>
       <w:r>
         <w:rPr>
@@ -107,7 +107,7 @@
           <w:rFonts w:ascii="Times New Roman" w:hAnsi="Times New Roman" w:eastAsia="Times New Roman" w:cs="Times New Roman"/>
           <w:sz w:val="20"/>
         </w:rPr>
-        <w:t xml:space="preserve">multiple public sources for the continental Portuguese 60–400 kV grid</w:t>
+        <w:t xml:space="preserve">sources for the continental Portuguese 60–400 kV network and the</w:t>
       </w:r>
       <w:r>
         <w:rPr>
@@ -121,7 +121,7 @@
           <w:rFonts w:ascii="Times New Roman" w:hAnsi="Times New Roman" w:eastAsia="Times New Roman" w:cs="Times New Roman"/>
           <w:sz w:val="20"/>
         </w:rPr>
-        <w:t xml:space="preserve">and the Portugal–Spain interconnection boundary. SimPT60 organizes the</w:t>
+        <w:t xml:space="preserve">Portugal–Spain interconnection boundary. The dataset brings the static</w:t>
       </w:r>
       <w:r>
         <w:rPr>
@@ -135,7 +135,7 @@
           <w:rFonts w:ascii="Times New Roman" w:hAnsi="Times New Roman" w:eastAsia="Times New Roman" w:cs="Times New Roman"/>
           <w:sz w:val="20"/>
         </w:rPr>
-        <w:t xml:space="preserve">static network, operating time series, and alternating-current (AC)</w:t>
+        <w:t xml:space="preserve">network, operating time series, and alternating-current (AC) power-flow</w:t>
       </w:r>
       <w:r>
         <w:rPr>
@@ -149,7 +149,7 @@
           <w:rFonts w:ascii="Times New Roman" w:hAnsi="Times New Roman" w:eastAsia="Times New Roman" w:cs="Times New Roman"/>
           <w:sz w:val="20"/>
         </w:rPr>
-        <w:t xml:space="preserve">power-flow results in a unified data framework. It provides continuous</w:t>
+        <w:t xml:space="preserve">results into a unified data framework, providing continuous 15-minute</w:t>
       </w:r>
       <w:r>
         <w:rPr>
@@ -163,7 +163,7 @@
           <w:rFonts w:ascii="Times New Roman" w:hAnsi="Times New Roman" w:eastAsia="Times New Roman" w:cs="Times New Roman"/>
           <w:sz w:val="20"/>
         </w:rPr>
-        <w:t xml:space="preserve">15-minute operating cases, source-level provenance, and validation</w:t>
+        <w:t xml:space="preserve">operating cases, source-level provenance, and data products for</w:t>
       </w:r>
       <w:r>
         <w:rPr>
@@ -177,7 +177,7 @@
           <w:rFonts w:ascii="Times New Roman" w:hAnsi="Times New Roman" w:eastAsia="Times New Roman" w:cs="Times New Roman"/>
           <w:sz w:val="20"/>
         </w:rPr>
-        <w:t xml:space="preserve">products for assessing model consistency. The dataset supports</w:t>
+        <w:t xml:space="preserve">assessing model consistency. SimPT60 supports time-series power-flow</w:t>
       </w:r>
       <w:r>
         <w:rPr>
@@ -191,7 +191,7 @@
           <w:rFonts w:ascii="Times New Roman" w:hAnsi="Times New Roman" w:eastAsia="Times New Roman" w:cs="Times New Roman"/>
           <w:sz w:val="20"/>
         </w:rPr>
-        <w:t xml:space="preserve">time-series power-flow studies, scenario comparison, relative-risk</w:t>
+        <w:t xml:space="preserve">analysis, scenario comparison, relative-risk screening, and testing of</w:t>
       </w:r>
       <w:r>
         <w:rPr>
@@ -205,7 +205,7 @@
           <w:rFonts w:ascii="Times New Roman" w:hAnsi="Times New Roman" w:eastAsia="Times New Roman" w:cs="Times New Roman"/>
           <w:sz w:val="20"/>
         </w:rPr>
-        <w:t xml:space="preserve">screening, and testing of grid-analysis algorithms. Its research utility</w:t>
+        <w:t xml:space="preserve">grid-analysis algorithms. To demonstrate its research utility, we use</w:t>
       </w:r>
       <w:r>
         <w:rPr>
@@ -219,7 +219,7 @@
           <w:rFonts w:ascii="Times New Roman" w:hAnsi="Times New Roman" w:eastAsia="Times New Roman" w:cs="Times New Roman"/>
           <w:sz w:val="20"/>
         </w:rPr>
-        <w:t xml:space="preserve">is demonstrated using E-REDES public datasets that were withheld from</w:t>
+        <w:t xml:space="preserve">public E-REDES data withheld from nodal-power construction,</w:t>
       </w:r>
       <w:r>
         <w:rPr>
@@ -233,7 +233,7 @@
           <w:rFonts w:ascii="Times New Roman" w:hAnsi="Times New Roman" w:eastAsia="Times New Roman" w:cs="Times New Roman"/>
           <w:sz w:val="20"/>
         </w:rPr>
-        <w:t xml:space="preserve">nodal-power construction, parameter-sensitivity experiments, and</w:t>
+        <w:t xml:space="preserve">parameter-sensitivity analysis, and single-element (N−1) contingency</w:t>
       </w:r>
       <w:r>
         <w:rPr>
@@ -247,7 +247,7 @@
           <w:rFonts w:ascii="Times New Roman" w:hAnsi="Times New Roman" w:eastAsia="Times New Roman" w:cs="Times New Roman"/>
           <w:sz w:val="20"/>
         </w:rPr>
-        <w:t xml:space="preserve">single-element (N−1) contingency screening. SimPT60 is a</w:t>
+        <w:t xml:space="preserve">screening. As a public-data-derived research model, SimPT60 has not been</w:t>
       </w:r>
       <w:r>
         <w:rPr>
@@ -261,21 +261,7 @@
           <w:rFonts w:ascii="Times New Roman" w:hAnsi="Times New Roman" w:eastAsia="Times New Roman" w:cs="Times New Roman"/>
           <w:sz w:val="20"/>
         </w:rPr>
-        <w:t xml:space="preserve">public-data-derived research model and has not been validated as an</w:t>
-      </w:r>
-      <w:r>
-        <w:rPr>
-          <w:rFonts w:ascii="Times New Roman" w:hAnsi="Times New Roman" w:eastAsia="Times New Roman" w:cs="Times New Roman"/>
-          <w:sz w:val="20"/>
-        </w:rPr>
-        <w:t xml:space="preserve"> </w:t>
-      </w:r>
-      <w:r>
-        <w:rPr>
-          <w:rFonts w:ascii="Times New Roman" w:hAnsi="Times New Roman" w:eastAsia="Times New Roman" w:cs="Times New Roman"/>
-          <w:sz w:val="20"/>
-        </w:rPr>
-        <w:t xml:space="preserve">operator network model at equipment level.</w:t>
+        <w:t xml:space="preserve">validated against an operator network model at the equipment level.</w:t>
       </w:r>
     </w:p>
     <w:bookmarkStart w:id="22" w:name="background-summary"/>

</xml_diff>